<commit_message>
Aggiunto la colonna saldo nei codstat
</commit_message>
<xml_diff>
--- a/dati/Manuale Utente.docx
+++ b/dati/Manuale Utente.docx
@@ -1104,15 +1104,7 @@
         <w:t xml:space="preserve"> </w:t>
       </w:r>
       <w:r>
-        <w:t xml:space="preserve">qui ho utilizzato le parentesi quadre </w:t>
-      </w:r>
-      <w:proofErr w:type="gramStart"/>
-      <w:r>
-        <w:t>‘[</w:t>
-      </w:r>
-      <w:proofErr w:type="gramEnd"/>
-      <w:r>
-        <w:t>…]’</w:t>
+        <w:t>qui ho utilizzato le parentesi quadre ‘[…]’</w:t>
       </w:r>
       <w:r>
         <w:t xml:space="preserve"> Quindi il nome del file sarà così costruito:</w:t>
@@ -1123,15 +1115,7 @@
         <w:pStyle w:val="Esempio"/>
       </w:pPr>
       <w:r>
-        <w:t>{prefx_</w:t>
-      </w:r>
-      <w:proofErr w:type="gramStart"/>
-      <w:r>
-        <w:t>std}_</w:t>
-      </w:r>
-      <w:proofErr w:type="gramEnd"/>
-      <w:r>
-        <w:t>{idBanca}_{periodo}_[{cardHolder}].csv</w:t>
+        <w:t>{prefx_std}_{idBanca}_{periodo}_[{cardHolder}].csv</w:t>
       </w:r>
     </w:p>
     <w:p>
@@ -1721,25 +1705,7 @@
           <w:sz w:val="20"/>
           <w:szCs w:val="20"/>
         </w:rPr>
-        <w:t>Java (TM) SE Development Kit XX.</w:t>
-      </w:r>
-      <w:proofErr w:type="gramStart"/>
-      <w:r>
-        <w:rPr>
-          <w:rFonts w:ascii="Consolas" w:hAnsi="Consolas"/>
-          <w:sz w:val="20"/>
-          <w:szCs w:val="20"/>
-        </w:rPr>
-        <w:t>YY.ZZ</w:t>
-      </w:r>
-      <w:proofErr w:type="gramEnd"/>
-      <w:r>
-        <w:rPr>
-          <w:rFonts w:ascii="Consolas" w:hAnsi="Consolas"/>
-          <w:sz w:val="20"/>
-          <w:szCs w:val="20"/>
-        </w:rPr>
-        <w:t xml:space="preserve"> </w:t>
+        <w:t xml:space="preserve">Java (TM) SE Development Kit XX.YY.ZZ </w:t>
       </w:r>
       <w:r>
         <w:t>“ (chiamato JDK)</w:t>
@@ -1904,18 +1870,9 @@
           <w:b/>
           <w:bCs/>
         </w:rPr>
-        <w:t>xx.</w:t>
-      </w:r>
-      <w:proofErr w:type="gramStart"/>
-      <w:r>
-        <w:rPr>
-          <w:b/>
-          <w:bCs/>
-        </w:rPr>
-        <w:t>yy.zz</w:t>
+        <w:t>xx.yy.zz</w:t>
       </w:r>
       <w:proofErr w:type="spellEnd"/>
-      <w:proofErr w:type="gramEnd"/>
       <w:r>
         <w:rPr>
           <w:b/>
@@ -3430,13 +3387,7 @@
         <w:t>hanno già</w:t>
       </w:r>
       <w:r>
-        <w:t xml:space="preserve"> un </w:t>
-      </w:r>
-      <w:r>
-        <w:t>CdSt</w:t>
-      </w:r>
-      <w:r>
-        <w:t xml:space="preserve"> assegnato. L’algoritmo </w:t>
+        <w:t xml:space="preserve"> un CdSt assegnato. L’algoritmo </w:t>
       </w:r>
       <w:r>
         <w:rPr>
@@ -3458,10 +3409,7 @@
         <w:t xml:space="preserve">i </w:t>
       </w:r>
       <w:r>
-        <w:t xml:space="preserve">relativi </w:t>
-      </w:r>
-      <w:r>
-        <w:t>CdSt</w:t>
+        <w:t>relativi CdSt</w:t>
       </w:r>
       <w:r>
         <w:t xml:space="preserve">. Tutto questo </w:t>
@@ -3489,13 +3437,7 @@
         <w:t>non</w:t>
       </w:r>
       <w:r>
-        <w:t xml:space="preserve"> hanno il </w:t>
-      </w:r>
-      <w:r>
-        <w:t>CdSt</w:t>
-      </w:r>
-      <w:r>
-        <w:t>.</w:t>
+        <w:t xml:space="preserve"> hanno il CdSt.</w:t>
       </w:r>
     </w:p>
     <w:p>
@@ -3510,10 +3452,7 @@
         <w:t>descrizione</w:t>
       </w:r>
       <w:r>
-        <w:t xml:space="preserve">” del movimento senza CdSt. Questi verifica nel proprio Data Base quale </w:t>
-      </w:r>
-      <w:r>
-        <w:t>“</w:t>
+        <w:t>” del movimento senza CdSt. Questi verifica nel proprio Data Base quale “</w:t>
       </w:r>
       <w:r>
         <w:rPr>
@@ -3523,10 +3462,7 @@
         <w:t>descrizione</w:t>
       </w:r>
       <w:r>
-        <w:t>”</w:t>
-      </w:r>
-      <w:r>
-        <w:t xml:space="preserve"> assomiglia il più possibile </w:t>
+        <w:t xml:space="preserve">” assomiglia il più possibile </w:t>
       </w:r>
       <w:r>
         <w:t xml:space="preserve">alle descrizioni con CdSt. Il risultato è di </w:t>
@@ -3723,6 +3659,9 @@
       <w:r>
         <w:t>Individuare nella finestra delle registrazioni orfane che appartengono ad un singolo CdSt</w:t>
       </w:r>
+      <w:r>
+        <w:t xml:space="preserve"> (nel esempio sotto sono le righe evidenziate in azzurro)</w:t>
+      </w:r>
     </w:p>
     <w:p>
       <w:pPr>
@@ -3775,13 +3714,7 @@
         </w:numPr>
       </w:pPr>
       <w:r>
-        <w:t xml:space="preserve">Andare nella finestra </w:t>
-      </w:r>
-      <w:r>
-        <w:t>“Visualizzazione Codici Statistici”</w:t>
-      </w:r>
-      <w:r>
-        <w:t xml:space="preserve">, cercare il CdSt con una parola, es: “Hotel” </w:t>
+        <w:t xml:space="preserve">Andare nella finestra “Visualizzazione Codici Statistici”, cercare il CdSt con una parola, es: “Hotel” </w:t>
       </w:r>
     </w:p>
     <w:p>
@@ -4080,14 +4013,12 @@
     <w:r>
       <w:ptab w:relativeTo="margin" w:alignment="right" w:leader="none"/>
     </w:r>
-    <w:proofErr w:type="gramStart"/>
     <w:r>
       <w:t xml:space="preserve">1 </w:t>
     </w:r>
     <w:r>
       <w:t>Febbraio</w:t>
     </w:r>
-    <w:proofErr w:type="gramEnd"/>
     <w:r>
       <w:t xml:space="preserve"> 2025</w:t>
     </w:r>
@@ -6137,7 +6068,9 @@
   <w:rsids>
     <w:rsidRoot w:val="009D6C4A"/>
     <w:rsid w:val="000309D9"/>
+    <w:rsid w:val="001E6126"/>
     <w:rsid w:val="002A7640"/>
+    <w:rsid w:val="005F05A4"/>
     <w:rsid w:val="006B62CD"/>
     <w:rsid w:val="006F5ECB"/>
     <w:rsid w:val="009D6C4A"/>

</xml_diff>

<commit_message>
Implementato l'import di CodStat da file Excel/CSV
</commit_message>
<xml_diff>
--- a/dati/Manuale Utente.docx
+++ b/dati/Manuale Utente.docx
@@ -56,7 +56,7 @@
           <w:r>
             <w:fldChar w:fldCharType="separate"/>
           </w:r>
-          <w:hyperlink w:anchor="_Toc189322894" w:history="1">
+          <w:hyperlink w:anchor="_Toc225612074" w:history="1">
             <w:r>
               <w:rPr>
                 <w:rStyle w:val="Collegamentoipertestuale"/>
@@ -83,7 +83,7 @@
                 <w:noProof/>
                 <w:webHidden/>
               </w:rPr>
-              <w:instrText xml:space="preserve"> PAGEREF _Toc189322894 \h </w:instrText>
+              <w:instrText xml:space="preserve"> PAGEREF _Toc225612074 \h </w:instrText>
             </w:r>
             <w:r>
               <w:rPr>
@@ -127,7 +127,7 @@
               <w:lang w:eastAsia="it-IT"/>
             </w:rPr>
           </w:pPr>
-          <w:hyperlink w:anchor="_Toc189322895" w:history="1">
+          <w:hyperlink w:anchor="_Toc225612075" w:history="1">
             <w:r>
               <w:rPr>
                 <w:rStyle w:val="Collegamentoipertestuale"/>
@@ -154,7 +154,7 @@
                 <w:noProof/>
                 <w:webHidden/>
               </w:rPr>
-              <w:instrText xml:space="preserve"> PAGEREF _Toc189322895 \h </w:instrText>
+              <w:instrText xml:space="preserve"> PAGEREF _Toc225612075 \h </w:instrText>
             </w:r>
             <w:r>
               <w:rPr>
@@ -198,7 +198,7 @@
               <w:lang w:eastAsia="it-IT"/>
             </w:rPr>
           </w:pPr>
-          <w:hyperlink w:anchor="_Toc189322896" w:history="1">
+          <w:hyperlink w:anchor="_Toc225612076" w:history="1">
             <w:r>
               <w:rPr>
                 <w:rStyle w:val="Collegamentoipertestuale"/>
@@ -225,7 +225,7 @@
                 <w:noProof/>
                 <w:webHidden/>
               </w:rPr>
-              <w:instrText xml:space="preserve"> PAGEREF _Toc189322896 \h </w:instrText>
+              <w:instrText xml:space="preserve"> PAGEREF _Toc225612076 \h </w:instrText>
             </w:r>
             <w:r>
               <w:rPr>
@@ -269,7 +269,7 @@
               <w:lang w:eastAsia="it-IT"/>
             </w:rPr>
           </w:pPr>
-          <w:hyperlink w:anchor="_Toc189322897" w:history="1">
+          <w:hyperlink w:anchor="_Toc225612077" w:history="1">
             <w:r>
               <w:rPr>
                 <w:rStyle w:val="Collegamentoipertestuale"/>
@@ -296,7 +296,7 @@
                 <w:noProof/>
                 <w:webHidden/>
               </w:rPr>
-              <w:instrText xml:space="preserve"> PAGEREF _Toc189322897 \h </w:instrText>
+              <w:instrText xml:space="preserve"> PAGEREF _Toc225612077 \h </w:instrText>
             </w:r>
             <w:r>
               <w:rPr>
@@ -340,7 +340,7 @@
               <w:lang w:eastAsia="it-IT"/>
             </w:rPr>
           </w:pPr>
-          <w:hyperlink w:anchor="_Toc189322898" w:history="1">
+          <w:hyperlink w:anchor="_Toc225612078" w:history="1">
             <w:r>
               <w:rPr>
                 <w:rStyle w:val="Collegamentoipertestuale"/>
@@ -367,7 +367,7 @@
                 <w:noProof/>
                 <w:webHidden/>
               </w:rPr>
-              <w:instrText xml:space="preserve"> PAGEREF _Toc189322898 \h </w:instrText>
+              <w:instrText xml:space="preserve"> PAGEREF _Toc225612078 \h </w:instrText>
             </w:r>
             <w:r>
               <w:rPr>
@@ -411,7 +411,7 @@
               <w:lang w:eastAsia="it-IT"/>
             </w:rPr>
           </w:pPr>
-          <w:hyperlink w:anchor="_Toc189322899" w:history="1">
+          <w:hyperlink w:anchor="_Toc225612079" w:history="1">
             <w:r>
               <w:rPr>
                 <w:rStyle w:val="Collegamentoipertestuale"/>
@@ -438,7 +438,7 @@
                 <w:noProof/>
                 <w:webHidden/>
               </w:rPr>
-              <w:instrText xml:space="preserve"> PAGEREF _Toc189322899 \h </w:instrText>
+              <w:instrText xml:space="preserve"> PAGEREF _Toc225612079 \h </w:instrText>
             </w:r>
             <w:r>
               <w:rPr>
@@ -482,13 +482,13 @@
               <w:lang w:eastAsia="it-IT"/>
             </w:rPr>
           </w:pPr>
-          <w:hyperlink w:anchor="_Toc189322900" w:history="1">
+          <w:hyperlink w:anchor="_Toc225612080" w:history="1">
             <w:r>
               <w:rPr>
                 <w:rStyle w:val="Collegamentoipertestuale"/>
                 <w:noProof/>
               </w:rPr>
-              <w:t>Import dei dati</w:t>
+              <w:t>File properties “Banca.properties”</w:t>
             </w:r>
             <w:r>
               <w:rPr>
@@ -509,7 +509,7 @@
                 <w:noProof/>
                 <w:webHidden/>
               </w:rPr>
-              <w:instrText xml:space="preserve"> PAGEREF _Toc189322900 \h </w:instrText>
+              <w:instrText xml:space="preserve"> PAGEREF _Toc225612080 \h </w:instrText>
             </w:r>
             <w:r>
               <w:rPr>
@@ -553,13 +553,13 @@
               <w:lang w:eastAsia="it-IT"/>
             </w:rPr>
           </w:pPr>
-          <w:hyperlink w:anchor="_Toc189322901" w:history="1">
+          <w:hyperlink w:anchor="_Toc225612081" w:history="1">
             <w:r>
               <w:rPr>
                 <w:rStyle w:val="Collegamentoipertestuale"/>
                 <w:noProof/>
               </w:rPr>
-              <w:t>Struttura direttorio di Backup files CSV</w:t>
+              <w:t>“Cardid” Codici Card Holders</w:t>
             </w:r>
             <w:r>
               <w:rPr>
@@ -580,7 +580,7 @@
                 <w:noProof/>
                 <w:webHidden/>
               </w:rPr>
-              <w:instrText xml:space="preserve"> PAGEREF _Toc189322901 \h </w:instrText>
+              <w:instrText xml:space="preserve"> PAGEREF _Toc225612081 \h </w:instrText>
             </w:r>
             <w:r>
               <w:rPr>
@@ -601,6 +601,77 @@
                 <w:webHidden/>
               </w:rPr>
               <w:t>8</w:t>
+            </w:r>
+            <w:r>
+              <w:rPr>
+                <w:noProof/>
+                <w:webHidden/>
+              </w:rPr>
+              <w:fldChar w:fldCharType="end"/>
+            </w:r>
+          </w:hyperlink>
+        </w:p>
+        <w:p>
+          <w:pPr>
+            <w:pStyle w:val="Sommario1"/>
+            <w:tabs>
+              <w:tab w:val="right" w:leader="dot" w:pos="9628"/>
+            </w:tabs>
+            <w:rPr>
+              <w:rFonts w:asciiTheme="minorHAnsi" w:eastAsiaTheme="minorEastAsia" w:hAnsiTheme="minorHAnsi"/>
+              <w:noProof/>
+              <w:sz w:val="24"/>
+              <w:lang w:eastAsia="it-IT"/>
+            </w:rPr>
+          </w:pPr>
+          <w:hyperlink w:anchor="_Toc225612082" w:history="1">
+            <w:r>
+              <w:rPr>
+                <w:rStyle w:val="Collegamentoipertestuale"/>
+                <w:noProof/>
+              </w:rPr>
+              <w:t>Import dei dati</w:t>
+            </w:r>
+            <w:r>
+              <w:rPr>
+                <w:noProof/>
+                <w:webHidden/>
+              </w:rPr>
+              <w:tab/>
+            </w:r>
+            <w:r>
+              <w:rPr>
+                <w:noProof/>
+                <w:webHidden/>
+              </w:rPr>
+              <w:fldChar w:fldCharType="begin"/>
+            </w:r>
+            <w:r>
+              <w:rPr>
+                <w:noProof/>
+                <w:webHidden/>
+              </w:rPr>
+              <w:instrText xml:space="preserve"> PAGEREF _Toc225612082 \h </w:instrText>
+            </w:r>
+            <w:r>
+              <w:rPr>
+                <w:noProof/>
+                <w:webHidden/>
+              </w:rPr>
+            </w:r>
+            <w:r>
+              <w:rPr>
+                <w:noProof/>
+                <w:webHidden/>
+              </w:rPr>
+              <w:fldChar w:fldCharType="separate"/>
+            </w:r>
+            <w:r>
+              <w:rPr>
+                <w:noProof/>
+                <w:webHidden/>
+              </w:rPr>
+              <w:t>9</w:t>
             </w:r>
             <w:r>
               <w:rPr>
@@ -624,13 +695,13 @@
               <w:lang w:eastAsia="it-IT"/>
             </w:rPr>
           </w:pPr>
-          <w:hyperlink w:anchor="_Toc189322902" w:history="1">
+          <w:hyperlink w:anchor="_Toc225612083" w:history="1">
             <w:r>
               <w:rPr>
                 <w:rStyle w:val="Collegamentoipertestuale"/>
                 <w:noProof/>
               </w:rPr>
-              <w:t>Import dei files</w:t>
+              <w:t>Struttura direttorio di Backup files CSV</w:t>
             </w:r>
             <w:r>
               <w:rPr>
@@ -651,7 +722,7 @@
                 <w:noProof/>
                 <w:webHidden/>
               </w:rPr>
-              <w:instrText xml:space="preserve"> PAGEREF _Toc189322902 \h </w:instrText>
+              <w:instrText xml:space="preserve"> PAGEREF _Toc225612083 \h </w:instrText>
             </w:r>
             <w:r>
               <w:rPr>
@@ -695,12 +766,83 @@
               <w:lang w:eastAsia="it-IT"/>
             </w:rPr>
           </w:pPr>
-          <w:hyperlink w:anchor="_Toc189322903" w:history="1">
+          <w:hyperlink w:anchor="_Toc225612084" w:history="1">
             <w:r>
               <w:rPr>
                 <w:rStyle w:val="Collegamentoipertestuale"/>
                 <w:noProof/>
               </w:rPr>
+              <w:t>Import dei files</w:t>
+            </w:r>
+            <w:r>
+              <w:rPr>
+                <w:noProof/>
+                <w:webHidden/>
+              </w:rPr>
+              <w:tab/>
+            </w:r>
+            <w:r>
+              <w:rPr>
+                <w:noProof/>
+                <w:webHidden/>
+              </w:rPr>
+              <w:fldChar w:fldCharType="begin"/>
+            </w:r>
+            <w:r>
+              <w:rPr>
+                <w:noProof/>
+                <w:webHidden/>
+              </w:rPr>
+              <w:instrText xml:space="preserve"> PAGEREF _Toc225612084 \h </w:instrText>
+            </w:r>
+            <w:r>
+              <w:rPr>
+                <w:noProof/>
+                <w:webHidden/>
+              </w:rPr>
+            </w:r>
+            <w:r>
+              <w:rPr>
+                <w:noProof/>
+                <w:webHidden/>
+              </w:rPr>
+              <w:fldChar w:fldCharType="separate"/>
+            </w:r>
+            <w:r>
+              <w:rPr>
+                <w:noProof/>
+                <w:webHidden/>
+              </w:rPr>
+              <w:t>10</w:t>
+            </w:r>
+            <w:r>
+              <w:rPr>
+                <w:noProof/>
+                <w:webHidden/>
+              </w:rPr>
+              <w:fldChar w:fldCharType="end"/>
+            </w:r>
+          </w:hyperlink>
+        </w:p>
+        <w:p>
+          <w:pPr>
+            <w:pStyle w:val="Sommario2"/>
+            <w:tabs>
+              <w:tab w:val="right" w:leader="dot" w:pos="9628"/>
+            </w:tabs>
+            <w:rPr>
+              <w:rFonts w:asciiTheme="minorHAnsi" w:eastAsiaTheme="minorEastAsia" w:hAnsiTheme="minorHAnsi"/>
+              <w:noProof/>
+              <w:sz w:val="24"/>
+              <w:lang w:eastAsia="it-IT"/>
+            </w:rPr>
+          </w:pPr>
+          <w:hyperlink w:anchor="_Toc225612085" w:history="1">
+            <w:r>
+              <w:rPr>
+                <w:rStyle w:val="Collegamentoipertestuale"/>
+                <w:noProof/>
+              </w:rPr>
               <w:t>Comunicazioni di Log</w:t>
             </w:r>
             <w:r>
@@ -722,7 +864,7 @@
                 <w:noProof/>
                 <w:webHidden/>
               </w:rPr>
-              <w:instrText xml:space="preserve"> PAGEREF _Toc189322903 \h </w:instrText>
+              <w:instrText xml:space="preserve"> PAGEREF _Toc225612085 \h </w:instrText>
             </w:r>
             <w:r>
               <w:rPr>
@@ -742,7 +884,7 @@
                 <w:noProof/>
                 <w:webHidden/>
               </w:rPr>
-              <w:t>9</w:t>
+              <w:t>10</w:t>
             </w:r>
             <w:r>
               <w:rPr>
@@ -766,12 +908,83 @@
               <w:lang w:eastAsia="it-IT"/>
             </w:rPr>
           </w:pPr>
-          <w:hyperlink w:anchor="_Toc189322904" w:history="1">
+          <w:hyperlink w:anchor="_Toc225612086" w:history="1">
             <w:r>
               <w:rPr>
                 <w:rStyle w:val="Collegamentoipertestuale"/>
                 <w:noProof/>
               </w:rPr>
+              <w:t>Import codici Statistici</w:t>
+            </w:r>
+            <w:r>
+              <w:rPr>
+                <w:noProof/>
+                <w:webHidden/>
+              </w:rPr>
+              <w:tab/>
+            </w:r>
+            <w:r>
+              <w:rPr>
+                <w:noProof/>
+                <w:webHidden/>
+              </w:rPr>
+              <w:fldChar w:fldCharType="begin"/>
+            </w:r>
+            <w:r>
+              <w:rPr>
+                <w:noProof/>
+                <w:webHidden/>
+              </w:rPr>
+              <w:instrText xml:space="preserve"> PAGEREF _Toc225612086 \h </w:instrText>
+            </w:r>
+            <w:r>
+              <w:rPr>
+                <w:noProof/>
+                <w:webHidden/>
+              </w:rPr>
+            </w:r>
+            <w:r>
+              <w:rPr>
+                <w:noProof/>
+                <w:webHidden/>
+              </w:rPr>
+              <w:fldChar w:fldCharType="separate"/>
+            </w:r>
+            <w:r>
+              <w:rPr>
+                <w:noProof/>
+                <w:webHidden/>
+              </w:rPr>
+              <w:t>12</w:t>
+            </w:r>
+            <w:r>
+              <w:rPr>
+                <w:noProof/>
+                <w:webHidden/>
+              </w:rPr>
+              <w:fldChar w:fldCharType="end"/>
+            </w:r>
+          </w:hyperlink>
+        </w:p>
+        <w:p>
+          <w:pPr>
+            <w:pStyle w:val="Sommario1"/>
+            <w:tabs>
+              <w:tab w:val="right" w:leader="dot" w:pos="9628"/>
+            </w:tabs>
+            <w:rPr>
+              <w:rFonts w:asciiTheme="minorHAnsi" w:eastAsiaTheme="minorEastAsia" w:hAnsiTheme="minorHAnsi"/>
+              <w:noProof/>
+              <w:sz w:val="24"/>
+              <w:lang w:eastAsia="it-IT"/>
+            </w:rPr>
+          </w:pPr>
+          <w:hyperlink w:anchor="_Toc225612087" w:history="1">
+            <w:r>
+              <w:rPr>
+                <w:rStyle w:val="Collegamentoipertestuale"/>
+                <w:noProof/>
+              </w:rPr>
               <w:t>Indovina Codici Statistici</w:t>
             </w:r>
             <w:r>
@@ -793,7 +1006,7 @@
                 <w:noProof/>
                 <w:webHidden/>
               </w:rPr>
-              <w:instrText xml:space="preserve"> PAGEREF _Toc189322904 \h </w:instrText>
+              <w:instrText xml:space="preserve"> PAGEREF _Toc225612087 \h </w:instrText>
             </w:r>
             <w:r>
               <w:rPr>
@@ -813,7 +1026,7 @@
                 <w:noProof/>
                 <w:webHidden/>
               </w:rPr>
-              <w:t>11</w:t>
+              <w:t>13</w:t>
             </w:r>
             <w:r>
               <w:rPr>
@@ -837,7 +1050,7 @@
               <w:lang w:eastAsia="it-IT"/>
             </w:rPr>
           </w:pPr>
-          <w:hyperlink w:anchor="_Toc189322905" w:history="1">
+          <w:hyperlink w:anchor="_Toc225612088" w:history="1">
             <w:r>
               <w:rPr>
                 <w:rStyle w:val="Collegamentoipertestuale"/>
@@ -864,7 +1077,7 @@
                 <w:noProof/>
                 <w:webHidden/>
               </w:rPr>
-              <w:instrText xml:space="preserve"> PAGEREF _Toc189322905 \h </w:instrText>
+              <w:instrText xml:space="preserve"> PAGEREF _Toc225612088 \h </w:instrText>
             </w:r>
             <w:r>
               <w:rPr>
@@ -884,7 +1097,7 @@
                 <w:noProof/>
                 <w:webHidden/>
               </w:rPr>
-              <w:t>11</w:t>
+              <w:t>13</w:t>
             </w:r>
             <w:r>
               <w:rPr>
@@ -908,7 +1121,7 @@
               <w:lang w:eastAsia="it-IT"/>
             </w:rPr>
           </w:pPr>
-          <w:hyperlink w:anchor="_Toc189322906" w:history="1">
+          <w:hyperlink w:anchor="_Toc225612089" w:history="1">
             <w:r>
               <w:rPr>
                 <w:rStyle w:val="Collegamentoipertestuale"/>
@@ -935,7 +1148,7 @@
                 <w:noProof/>
                 <w:webHidden/>
               </w:rPr>
-              <w:instrText xml:space="preserve"> PAGEREF _Toc189322906 \h </w:instrText>
+              <w:instrText xml:space="preserve"> PAGEREF _Toc225612089 \h </w:instrText>
             </w:r>
             <w:r>
               <w:rPr>
@@ -955,7 +1168,7 @@
                 <w:noProof/>
                 <w:webHidden/>
               </w:rPr>
-              <w:t>12</w:t>
+              <w:t>14</w:t>
             </w:r>
             <w:r>
               <w:rPr>
@@ -994,7 +1207,7 @@
       <w:pPr>
         <w:pStyle w:val="Titolo1"/>
       </w:pPr>
-      <w:bookmarkStart w:id="0" w:name="_Toc189322894"/>
+      <w:bookmarkStart w:id="0" w:name="_Toc225612074"/>
       <w:r>
         <w:lastRenderedPageBreak/>
         <w:t>Preliminari</w:t>
@@ -1005,7 +1218,7 @@
       <w:pPr>
         <w:pStyle w:val="Titolo2"/>
       </w:pPr>
-      <w:bookmarkStart w:id="1" w:name="_Toc189322895"/>
+      <w:bookmarkStart w:id="1" w:name="_Toc225612075"/>
       <w:r>
         <w:t>Convenzione sui nomi dei files CSV</w:t>
       </w:r>
@@ -1104,7 +1317,15 @@
         <w:t xml:space="preserve"> </w:t>
       </w:r>
       <w:r>
-        <w:t>qui ho utilizzato le parentesi quadre ‘[…]’</w:t>
+        <w:t xml:space="preserve">qui ho utilizzato le parentesi quadre </w:t>
+      </w:r>
+      <w:proofErr w:type="gramStart"/>
+      <w:r>
+        <w:t>‘[</w:t>
+      </w:r>
+      <w:proofErr w:type="gramEnd"/>
+      <w:r>
+        <w:t>…]’</w:t>
       </w:r>
       <w:r>
         <w:t xml:space="preserve"> Quindi il nome del file sarà così costruito:</w:t>
@@ -1115,7 +1336,15 @@
         <w:pStyle w:val="Esempio"/>
       </w:pPr>
       <w:r>
-        <w:t>{prefx_std}_{idBanca}_{periodo}_[{cardHolder}].csv</w:t>
+        <w:t>{prefx_</w:t>
+      </w:r>
+      <w:proofErr w:type="gramStart"/>
+      <w:r>
+        <w:t>std}_</w:t>
+      </w:r>
+      <w:proofErr w:type="gramEnd"/>
+      <w:r>
+        <w:t>{idBanca}_{periodo}_[{cardHolder}].csv</w:t>
       </w:r>
     </w:p>
     <w:p>
@@ -1234,6 +1463,38 @@
       <w:r>
         <w:t>) il titolare dell’estratto conto (se esiste)</w:t>
       </w:r>
+      <w:r>
+        <w:br/>
+        <w:t xml:space="preserve">es: </w:t>
+      </w:r>
+      <w:r>
+        <w:tab/>
+      </w:r>
+      <w:r>
+        <w:rPr>
+          <w:rFonts w:ascii="Consolas" w:hAnsi="Consolas"/>
+          <w:sz w:val="20"/>
+          <w:szCs w:val="22"/>
+        </w:rPr>
+        <w:t>SMAC\estrattoconto_SMAC_2522_</w:t>
+      </w:r>
+      <w:r>
+        <w:rPr>
+          <w:rFonts w:ascii="Consolas" w:hAnsi="Consolas"/>
+          <w:sz w:val="20"/>
+          <w:szCs w:val="22"/>
+          <w:highlight w:val="green"/>
+        </w:rPr>
+        <w:t>cla</w:t>
+      </w:r>
+      <w:r>
+        <w:rPr>
+          <w:rFonts w:ascii="Consolas" w:hAnsi="Consolas"/>
+          <w:sz w:val="20"/>
+          <w:szCs w:val="22"/>
+        </w:rPr>
+        <w:t>.csv</w:t>
+      </w:r>
     </w:p>
     <w:p>
       <w:r>
@@ -1402,7 +1663,7 @@
       <w:pPr>
         <w:pStyle w:val="Titolo2"/>
       </w:pPr>
-      <w:bookmarkStart w:id="2" w:name="_Toc189322896"/>
+      <w:bookmarkStart w:id="2" w:name="_Toc225612076"/>
       <w:r>
         <w:lastRenderedPageBreak/>
         <w:t>Come verificare la runtime Java</w:t>
@@ -1705,14 +1966,45 @@
           <w:sz w:val="20"/>
           <w:szCs w:val="20"/>
         </w:rPr>
-        <w:t xml:space="preserve">Java (TM) SE Development Kit XX.YY.ZZ </w:t>
-      </w:r>
-      <w:r>
-        <w:t>“ (chiamato JDK)</w:t>
+        <w:t>Java (TM) SE Development Kit XX.</w:t>
+      </w:r>
+      <w:proofErr w:type="gramStart"/>
+      <w:r>
+        <w:rPr>
+          <w:rFonts w:ascii="Consolas" w:hAnsi="Consolas"/>
+          <w:sz w:val="20"/>
+          <w:szCs w:val="20"/>
+        </w:rPr>
+        <w:t>YY.ZZ</w:t>
+      </w:r>
+      <w:proofErr w:type="gramEnd"/>
+      <w:r>
+        <w:rPr>
+          <w:rFonts w:ascii="Consolas" w:hAnsi="Consolas"/>
+          <w:sz w:val="20"/>
+          <w:szCs w:val="20"/>
+        </w:rPr>
+        <w:t xml:space="preserve"> </w:t>
+      </w:r>
+      <w:proofErr w:type="gramStart"/>
+      <w:r>
+        <w:t>“ (</w:t>
+      </w:r>
+      <w:proofErr w:type="gramEnd"/>
+      <w:r>
+        <w:t>chiamato JDK)</w:t>
       </w:r>
       <w:r>
         <w:br/>
-        <w:t>dove XX.YY.ZZ è la versione istallata. Nel nostro caso abbiamo la versione 21.0.5</w:t>
+        <w:t>dove XX.</w:t>
+      </w:r>
+      <w:proofErr w:type="gramStart"/>
+      <w:r>
+        <w:t>YY.ZZ</w:t>
+      </w:r>
+      <w:proofErr w:type="gramEnd"/>
+      <w:r>
+        <w:t xml:space="preserve"> è la versione istallata. Nel nostro caso abbiamo la versione 21.0.5</w:t>
       </w:r>
     </w:p>
     <w:p>
@@ -1749,7 +2041,7 @@
       <w:pPr>
         <w:pStyle w:val="Titolo2"/>
       </w:pPr>
-      <w:bookmarkStart w:id="3" w:name="_Toc189322897"/>
+      <w:bookmarkStart w:id="3" w:name="_Toc225612077"/>
       <w:r>
         <w:lastRenderedPageBreak/>
         <w:t>Verifica installazione di JavaFX</w:t>
@@ -1870,9 +2162,18 @@
           <w:b/>
           <w:bCs/>
         </w:rPr>
-        <w:t>xx.yy.zz</w:t>
+        <w:t>xx.</w:t>
+      </w:r>
+      <w:proofErr w:type="gramStart"/>
+      <w:r>
+        <w:rPr>
+          <w:b/>
+          <w:bCs/>
+        </w:rPr>
+        <w:t>yy.zz</w:t>
       </w:r>
       <w:proofErr w:type="spellEnd"/>
+      <w:proofErr w:type="gramEnd"/>
       <w:r>
         <w:rPr>
           <w:b/>
@@ -1899,7 +2200,7 @@
       <w:pPr>
         <w:pStyle w:val="Titolo2"/>
       </w:pPr>
-      <w:bookmarkStart w:id="4" w:name="_Toc189322898"/>
+      <w:bookmarkStart w:id="4" w:name="_Toc225612078"/>
       <w:r>
         <w:t>Verifica delle variabili d’ambiente</w:t>
       </w:r>
@@ -2102,7 +2403,7 @@
       <w:pPr>
         <w:pStyle w:val="Titolo2"/>
       </w:pPr>
-      <w:bookmarkStart w:id="5" w:name="_Toc189322899"/>
+      <w:bookmarkStart w:id="5" w:name="_Toc225612079"/>
       <w:r>
         <w:t>Impostazione variabili d’ambiente</w:t>
       </w:r>
@@ -2513,27 +2814,240 @@
         <w:t>Verifica delle variabili d’ambiente”</w:t>
       </w:r>
     </w:p>
+    <w:p>
+      <w:pPr>
+        <w:pStyle w:val="Titolo1"/>
+      </w:pPr>
+      <w:bookmarkStart w:id="6" w:name="_Toc225612080"/>
+      <w:r>
+        <w:lastRenderedPageBreak/>
+        <w:t>File properties “</w:t>
+      </w:r>
+      <w:proofErr w:type="spellStart"/>
+      <w:r>
+        <w:t>Banca.properties</w:t>
+      </w:r>
+      <w:proofErr w:type="spellEnd"/>
+      <w:r>
+        <w:t>”</w:t>
+      </w:r>
+      <w:bookmarkEnd w:id="6"/>
+    </w:p>
+    <w:p>
+      <w:r>
+        <w:t>Il file di properties “</w:t>
+      </w:r>
+      <w:proofErr w:type="spellStart"/>
+      <w:r>
+        <w:t>Banca.properties</w:t>
+      </w:r>
+      <w:proofErr w:type="spellEnd"/>
+      <w:r>
+        <w:t>” contiene varie categorie di valori della serie:</w:t>
+      </w:r>
+    </w:p>
+    <w:p>
+      <w:pPr>
+        <w:pStyle w:val="Esempio"/>
+      </w:pPr>
+      <w:r>
+        <w:tab/>
+        <w:t xml:space="preserve">key = </w:t>
+      </w:r>
+      <w:proofErr w:type="spellStart"/>
+      <w:r>
+        <w:t>value</w:t>
+      </w:r>
+      <w:proofErr w:type="spellEnd"/>
+    </w:p>
+    <w:p>
+      <w:r>
+        <w:t>esempio per la categoria “DB”:</w:t>
+      </w:r>
+    </w:p>
+    <w:p>
+      <w:pPr>
+        <w:pStyle w:val="Esempio"/>
+      </w:pPr>
+      <w:proofErr w:type="spellStart"/>
+      <w:r>
+        <w:t>DB.Type</w:t>
+      </w:r>
+      <w:proofErr w:type="spellEnd"/>
+      <w:r>
+        <w:t>=</w:t>
+      </w:r>
+      <w:proofErr w:type="spellStart"/>
+      <w:r>
+        <w:t>SQLite</w:t>
+      </w:r>
+      <w:proofErr w:type="spellEnd"/>
+    </w:p>
+    <w:p>
+      <w:r>
+        <w:t xml:space="preserve">Qui si specifica che per la categoria del </w:t>
+      </w:r>
+      <w:proofErr w:type="spellStart"/>
+      <w:r>
+        <w:rPr>
+          <w:i/>
+          <w:iCs/>
+        </w:rPr>
+        <w:t>DataBase</w:t>
+      </w:r>
+      <w:proofErr w:type="spellEnd"/>
+      <w:r>
+        <w:rPr>
+          <w:i/>
+          <w:iCs/>
+        </w:rPr>
+        <w:t xml:space="preserve"> </w:t>
+      </w:r>
+      <w:r>
+        <w:t>il tipo di motore è “</w:t>
+      </w:r>
+      <w:proofErr w:type="spellStart"/>
+      <w:r>
+        <w:t>SQLite</w:t>
+      </w:r>
+      <w:proofErr w:type="spellEnd"/>
+      <w:r>
+        <w:t>”. Vedi elenco categorie completo qui di seguito</w:t>
+      </w:r>
+    </w:p>
+    <w:p>
+      <w:pPr>
+        <w:pStyle w:val="Titolo2"/>
+      </w:pPr>
+      <w:bookmarkStart w:id="7" w:name="_Toc225612081"/>
+      <w:r>
+        <w:t>“Cardid” Codici Card Holders</w:t>
+      </w:r>
+      <w:bookmarkEnd w:id="7"/>
+    </w:p>
+    <w:p>
+      <w:r>
+        <w:t xml:space="preserve">Con questi valori si associa i codici forniti dagli enti </w:t>
+      </w:r>
+      <w:proofErr w:type="gramStart"/>
+      <w:r>
+        <w:t>al Holder</w:t>
+      </w:r>
+      <w:proofErr w:type="gramEnd"/>
+      <w:r>
+        <w:t xml:space="preserve"> fisico (persona fisica) a cui appartiene l’eventuale Carta di Credito/Debito. Esempio:</w:t>
+      </w:r>
+    </w:p>
+    <w:p>
+      <w:pPr>
+        <w:pStyle w:val="Esempio"/>
+      </w:pPr>
+      <w:proofErr w:type="gramStart"/>
+      <w:r>
+        <w:t>cardid.assoc</w:t>
+      </w:r>
+      <w:proofErr w:type="gramEnd"/>
+      <w:r>
+        <w:t>.001=</w:t>
+      </w:r>
+      <w:proofErr w:type="gramStart"/>
+      <w:r>
+        <w:t>84806;cla</w:t>
+      </w:r>
+      <w:proofErr w:type="gramEnd"/>
+    </w:p>
+    <w:p>
+      <w:pPr>
+        <w:pStyle w:val="Esempio"/>
+      </w:pPr>
+      <w:proofErr w:type="gramStart"/>
+      <w:r>
+        <w:t>cardid.assoc</w:t>
+      </w:r>
+      <w:proofErr w:type="gramEnd"/>
+      <w:r>
+        <w:t>.002=</w:t>
+      </w:r>
+      <w:proofErr w:type="gramStart"/>
+      <w:r>
+        <w:t>85928;eug</w:t>
+      </w:r>
+      <w:proofErr w:type="gramEnd"/>
+    </w:p>
+    <w:p>
+      <w:r>
+        <w:t>Qui viene specificato che se trovo il codice “</w:t>
+      </w:r>
+      <w:r>
+        <w:t>84806</w:t>
+      </w:r>
+      <w:r>
+        <w:t>” allora la carta è di “</w:t>
+      </w:r>
+      <w:proofErr w:type="spellStart"/>
+      <w:r>
+        <w:t>cla</w:t>
+      </w:r>
+      <w:proofErr w:type="spellEnd"/>
+      <w:r>
+        <w:t>”, se trovo “</w:t>
+      </w:r>
+      <w:r>
+        <w:t>85928</w:t>
+      </w:r>
+      <w:r>
+        <w:t>” allora è di “</w:t>
+      </w:r>
+      <w:proofErr w:type="spellStart"/>
+      <w:r>
+        <w:t>eug</w:t>
+      </w:r>
+      <w:proofErr w:type="spellEnd"/>
+      <w:r>
+        <w:t>”</w:t>
+      </w:r>
+      <w:r>
+        <w:t>.</w:t>
+      </w:r>
+    </w:p>
+    <w:p>
+      <w:proofErr w:type="gramStart"/>
+      <w:r>
+        <w:t xml:space="preserve">Nella </w:t>
+      </w:r>
+      <w:r>
+        <w:rPr>
+          <w:i/>
+          <w:iCs/>
+        </w:rPr>
+        <w:t>key</w:t>
+      </w:r>
+      <w:proofErr w:type="gramEnd"/>
+      <w:r>
+        <w:t xml:space="preserve"> il “.001”, “.002” è il progressivo di associazione di modo da creare una “key” univoca.</w:t>
+      </w:r>
+    </w:p>
     <w:p/>
     <w:p>
       <w:pPr>
         <w:pStyle w:val="Titolo1"/>
       </w:pPr>
-      <w:bookmarkStart w:id="6" w:name="_Toc189322900"/>
+      <w:bookmarkStart w:id="8" w:name="_Toc225612082"/>
       <w:r>
         <w:lastRenderedPageBreak/>
         <w:t>Import dei dati</w:t>
       </w:r>
-      <w:bookmarkEnd w:id="6"/>
+      <w:bookmarkEnd w:id="8"/>
     </w:p>
     <w:p>
       <w:pPr>
         <w:pStyle w:val="Titolo2"/>
       </w:pPr>
-      <w:bookmarkStart w:id="7" w:name="_Toc189322901"/>
+      <w:bookmarkStart w:id="9" w:name="_Toc225612083"/>
       <w:r>
         <w:t>Struttura direttorio di Backup files CSV</w:t>
       </w:r>
-      <w:bookmarkEnd w:id="7"/>
+      <w:bookmarkEnd w:id="9"/>
     </w:p>
     <w:p>
       <w:r>
@@ -2722,11 +3236,11 @@
       <w:pPr>
         <w:pStyle w:val="Titolo2"/>
       </w:pPr>
-      <w:bookmarkStart w:id="8" w:name="_Toc189322902"/>
+      <w:bookmarkStart w:id="10" w:name="_Toc225612084"/>
       <w:r>
         <w:t>Import dei files</w:t>
       </w:r>
-      <w:bookmarkEnd w:id="8"/>
+      <w:bookmarkEnd w:id="10"/>
     </w:p>
     <w:p>
       <w:r>
@@ -3132,11 +3646,11 @@
       <w:pPr>
         <w:pStyle w:val="Titolo2"/>
       </w:pPr>
-      <w:bookmarkStart w:id="9" w:name="_Toc189322903"/>
+      <w:bookmarkStart w:id="11" w:name="_Toc225612085"/>
       <w:r>
         <w:t>Comunicazioni di Log</w:t>
       </w:r>
-      <w:bookmarkEnd w:id="9"/>
+      <w:bookmarkEnd w:id="11"/>
     </w:p>
     <w:p>
       <w:r>
@@ -3334,22 +3848,1591 @@
       <w:pPr>
         <w:pStyle w:val="Titolo1"/>
       </w:pPr>
-      <w:bookmarkStart w:id="10" w:name="_Toc189322904"/>
+      <w:bookmarkStart w:id="12" w:name="_Toc225612086"/>
+      <w:r>
+        <w:lastRenderedPageBreak/>
+        <w:t>Import codici Statistici</w:t>
+      </w:r>
+      <w:bookmarkEnd w:id="12"/>
+    </w:p>
+    <w:p>
+      <w:r>
+        <w:t xml:space="preserve">In fase iniziale è possibile importare i codici statistici costruiti a proprio piacere. Ovvio che quest’operazione è valida </w:t>
+      </w:r>
+      <w:r>
+        <w:rPr>
+          <w:b/>
+        </w:rPr>
+        <w:t>*SOLO*</w:t>
+      </w:r>
+      <w:r>
+        <w:t xml:space="preserve"> all’inizio della gestione con BANCA.</w:t>
+      </w:r>
+    </w:p>
+    <w:p>
+      <w:r>
+        <w:t xml:space="preserve">Infatti l’import dei codici Statistici </w:t>
+      </w:r>
+      <w:r>
+        <w:rPr>
+          <w:b/>
+        </w:rPr>
+        <w:t>implica l’azzeramento</w:t>
+      </w:r>
+      <w:r>
+        <w:t xml:space="preserve"> di classificazione statistica di tutti i movimenti</w:t>
+      </w:r>
+      <w:r>
+        <w:t xml:space="preserve"> già</w:t>
+      </w:r>
+      <w:r>
+        <w:t xml:space="preserve"> presenti! </w:t>
+      </w:r>
+      <w:r>
+        <w:br/>
+      </w:r>
+      <w:r>
+        <w:t xml:space="preserve">Dopo di questa operazione occorre ricominciare l’assegnazione </w:t>
+      </w:r>
+      <w:r>
+        <w:rPr>
+          <w:b/>
+        </w:rPr>
+        <w:t>da capo</w:t>
+      </w:r>
+      <w:r>
+        <w:t>!</w:t>
+      </w:r>
+    </w:p>
+    <w:p>
+      <w:r>
+        <w:t xml:space="preserve">Se siamo all’inizio possiamo costruire </w:t>
+      </w:r>
+      <w:proofErr w:type="gramStart"/>
+      <w:r>
+        <w:t>un fogli</w:t>
+      </w:r>
+      <w:proofErr w:type="gramEnd"/>
+      <w:r>
+        <w:t xml:space="preserve"> Excel che contenga le seguenti colonne:</w:t>
+      </w:r>
+    </w:p>
+    <w:p>
+      <w:pPr>
+        <w:pStyle w:val="Paragrafoelenco"/>
+        <w:numPr>
+          <w:ilvl w:val="0"/>
+          <w:numId w:val="13"/>
+        </w:numPr>
+      </w:pPr>
+      <w:r>
+        <w:rPr>
+          <w:b/>
+          <w:bCs/>
+        </w:rPr>
+        <w:t>cat1</w:t>
+      </w:r>
+      <w:r>
+        <w:t>: categoria con 1 solo codice</w:t>
+      </w:r>
+    </w:p>
+    <w:p>
+      <w:pPr>
+        <w:pStyle w:val="Paragrafoelenco"/>
+        <w:numPr>
+          <w:ilvl w:val="0"/>
+          <w:numId w:val="13"/>
+        </w:numPr>
+      </w:pPr>
+      <w:r>
+        <w:rPr>
+          <w:b/>
+          <w:bCs/>
+        </w:rPr>
+        <w:t>cat2</w:t>
+      </w:r>
+      <w:r>
+        <w:t>: categoria con 2 codici separato da punto</w:t>
+      </w:r>
+    </w:p>
+    <w:p>
+      <w:pPr>
+        <w:pStyle w:val="Paragrafoelenco"/>
+        <w:numPr>
+          <w:ilvl w:val="0"/>
+          <w:numId w:val="13"/>
+        </w:numPr>
+      </w:pPr>
+      <w:r>
+        <w:rPr>
+          <w:b/>
+          <w:bCs/>
+        </w:rPr>
+        <w:t>cat3</w:t>
+      </w:r>
+      <w:r>
+        <w:t>: categoria con 3 codici separato da 2 punti</w:t>
+      </w:r>
+    </w:p>
+    <w:p>
+      <w:pPr>
+        <w:pStyle w:val="Paragrafoelenco"/>
+        <w:numPr>
+          <w:ilvl w:val="0"/>
+          <w:numId w:val="13"/>
+        </w:numPr>
+      </w:pPr>
+      <w:r>
+        <w:rPr>
+          <w:b/>
+          <w:bCs/>
+        </w:rPr>
+        <w:t>Descrizione</w:t>
+      </w:r>
+      <w:r>
+        <w:t>: descrizione estesa del significato del codice statistico</w:t>
+      </w:r>
+    </w:p>
+    <w:p>
+      <w:r>
+        <w:t>Esempio</w:t>
+      </w:r>
+      <w:r>
+        <w:t xml:space="preserve"> di classificazione delle spese con codici</w:t>
+      </w:r>
+      <w:r>
+        <w:t>:</w:t>
+      </w:r>
+    </w:p>
+    <w:p/>
+    <w:tbl>
+      <w:tblPr>
+        <w:tblW w:w="8080" w:type="dxa"/>
+        <w:tblBorders>
+          <w:top w:val="single" w:sz="4" w:space="0" w:color="auto"/>
+          <w:left w:val="single" w:sz="4" w:space="0" w:color="auto"/>
+          <w:bottom w:val="single" w:sz="4" w:space="0" w:color="auto"/>
+          <w:right w:val="single" w:sz="4" w:space="0" w:color="auto"/>
+        </w:tblBorders>
+        <w:tblCellMar>
+          <w:left w:w="70" w:type="dxa"/>
+          <w:right w:w="70" w:type="dxa"/>
+        </w:tblCellMar>
+        <w:tblLook w:val="04A0" w:firstRow="1" w:lastRow="0" w:firstColumn="1" w:lastColumn="0" w:noHBand="0" w:noVBand="1"/>
+      </w:tblPr>
+      <w:tblGrid>
+        <w:gridCol w:w="529"/>
+        <w:gridCol w:w="642"/>
+        <w:gridCol w:w="921"/>
+        <w:gridCol w:w="6160"/>
+      </w:tblGrid>
+      <w:tr>
+        <w:trPr>
+          <w:trHeight w:val="300"/>
+        </w:trPr>
+        <w:tc>
+          <w:tcPr>
+            <w:tcW w:w="480" w:type="dxa"/>
+            <w:tcBorders>
+              <w:top w:val="single" w:sz="4" w:space="0" w:color="auto"/>
+              <w:bottom w:val="single" w:sz="4" w:space="0" w:color="auto"/>
+              <w:right w:val="single" w:sz="4" w:space="0" w:color="auto"/>
+            </w:tcBorders>
+            <w:noWrap/>
+            <w:vAlign w:val="bottom"/>
+            <w:hideMark/>
+          </w:tcPr>
+          <w:p>
+            <w:pPr>
+              <w:spacing w:before="0" w:after="0"/>
+              <w:contextualSpacing w:val="0"/>
+              <w:rPr>
+                <w:rFonts w:ascii="Calibri" w:eastAsia="Times New Roman" w:hAnsi="Calibri" w:cs="Calibri"/>
+                <w:b/>
+                <w:bCs/>
+                <w:color w:val="000000"/>
+                <w:kern w:val="0"/>
+                <w:szCs w:val="22"/>
+                <w:highlight w:val="lightGray"/>
+                <w:lang w:eastAsia="it-IT"/>
+                <w14:ligatures w14:val="none"/>
+              </w:rPr>
+            </w:pPr>
+            <w:r>
+              <w:rPr>
+                <w:rFonts w:ascii="Calibri" w:eastAsia="Times New Roman" w:hAnsi="Calibri" w:cs="Calibri"/>
+                <w:b/>
+                <w:bCs/>
+                <w:color w:val="000000"/>
+                <w:kern w:val="0"/>
+                <w:szCs w:val="22"/>
+                <w:highlight w:val="lightGray"/>
+                <w:lang w:eastAsia="it-IT"/>
+                <w14:ligatures w14:val="none"/>
+              </w:rPr>
+              <w:t>cat1</w:t>
+            </w:r>
+          </w:p>
+        </w:tc>
+        <w:tc>
+          <w:tcPr>
+            <w:tcW w:w="580" w:type="dxa"/>
+            <w:tcBorders>
+              <w:top w:val="single" w:sz="4" w:space="0" w:color="auto"/>
+              <w:left w:val="single" w:sz="4" w:space="0" w:color="auto"/>
+              <w:bottom w:val="single" w:sz="4" w:space="0" w:color="auto"/>
+              <w:right w:val="single" w:sz="4" w:space="0" w:color="auto"/>
+            </w:tcBorders>
+            <w:noWrap/>
+            <w:vAlign w:val="bottom"/>
+            <w:hideMark/>
+          </w:tcPr>
+          <w:p>
+            <w:pPr>
+              <w:spacing w:before="0" w:after="0"/>
+              <w:contextualSpacing w:val="0"/>
+              <w:rPr>
+                <w:rFonts w:ascii="Calibri" w:eastAsia="Times New Roman" w:hAnsi="Calibri" w:cs="Calibri"/>
+                <w:b/>
+                <w:bCs/>
+                <w:color w:val="000000"/>
+                <w:kern w:val="0"/>
+                <w:szCs w:val="22"/>
+                <w:highlight w:val="lightGray"/>
+                <w:lang w:eastAsia="it-IT"/>
+                <w14:ligatures w14:val="none"/>
+              </w:rPr>
+            </w:pPr>
+            <w:r>
+              <w:rPr>
+                <w:rFonts w:ascii="Calibri" w:eastAsia="Times New Roman" w:hAnsi="Calibri" w:cs="Calibri"/>
+                <w:b/>
+                <w:bCs/>
+                <w:color w:val="000000"/>
+                <w:kern w:val="0"/>
+                <w:szCs w:val="22"/>
+                <w:highlight w:val="lightGray"/>
+                <w:lang w:eastAsia="it-IT"/>
+                <w14:ligatures w14:val="none"/>
+              </w:rPr>
+              <w:t>cat2</w:t>
+            </w:r>
+          </w:p>
+        </w:tc>
+        <w:tc>
+          <w:tcPr>
+            <w:tcW w:w="860" w:type="dxa"/>
+            <w:tcBorders>
+              <w:top w:val="single" w:sz="4" w:space="0" w:color="auto"/>
+              <w:left w:val="single" w:sz="4" w:space="0" w:color="auto"/>
+              <w:bottom w:val="single" w:sz="4" w:space="0" w:color="auto"/>
+              <w:right w:val="single" w:sz="4" w:space="0" w:color="auto"/>
+            </w:tcBorders>
+            <w:noWrap/>
+            <w:vAlign w:val="bottom"/>
+            <w:hideMark/>
+          </w:tcPr>
+          <w:p>
+            <w:pPr>
+              <w:spacing w:before="0" w:after="0"/>
+              <w:contextualSpacing w:val="0"/>
+              <w:rPr>
+                <w:rFonts w:ascii="Calibri" w:eastAsia="Times New Roman" w:hAnsi="Calibri" w:cs="Calibri"/>
+                <w:b/>
+                <w:bCs/>
+                <w:color w:val="000000"/>
+                <w:kern w:val="0"/>
+                <w:szCs w:val="22"/>
+                <w:highlight w:val="lightGray"/>
+                <w:lang w:eastAsia="it-IT"/>
+                <w14:ligatures w14:val="none"/>
+              </w:rPr>
+            </w:pPr>
+            <w:r>
+              <w:rPr>
+                <w:rFonts w:ascii="Calibri" w:eastAsia="Times New Roman" w:hAnsi="Calibri" w:cs="Calibri"/>
+                <w:b/>
+                <w:bCs/>
+                <w:color w:val="000000"/>
+                <w:kern w:val="0"/>
+                <w:szCs w:val="22"/>
+                <w:highlight w:val="lightGray"/>
+                <w:lang w:eastAsia="it-IT"/>
+                <w14:ligatures w14:val="none"/>
+              </w:rPr>
+              <w:t>cat3</w:t>
+            </w:r>
+          </w:p>
+        </w:tc>
+        <w:tc>
+          <w:tcPr>
+            <w:tcW w:w="6160" w:type="dxa"/>
+            <w:tcBorders>
+              <w:top w:val="single" w:sz="4" w:space="0" w:color="auto"/>
+              <w:left w:val="single" w:sz="4" w:space="0" w:color="auto"/>
+              <w:bottom w:val="single" w:sz="4" w:space="0" w:color="auto"/>
+            </w:tcBorders>
+            <w:noWrap/>
+            <w:vAlign w:val="bottom"/>
+            <w:hideMark/>
+          </w:tcPr>
+          <w:p>
+            <w:pPr>
+              <w:spacing w:before="0" w:after="0"/>
+              <w:contextualSpacing w:val="0"/>
+              <w:rPr>
+                <w:rFonts w:ascii="Calibri" w:eastAsia="Times New Roman" w:hAnsi="Calibri" w:cs="Calibri"/>
+                <w:b/>
+                <w:bCs/>
+                <w:color w:val="000000"/>
+                <w:kern w:val="0"/>
+                <w:szCs w:val="22"/>
+                <w:highlight w:val="lightGray"/>
+                <w:lang w:eastAsia="it-IT"/>
+                <w14:ligatures w14:val="none"/>
+              </w:rPr>
+            </w:pPr>
+            <w:r>
+              <w:rPr>
+                <w:rFonts w:ascii="Calibri" w:eastAsia="Times New Roman" w:hAnsi="Calibri" w:cs="Calibri"/>
+                <w:b/>
+                <w:bCs/>
+                <w:color w:val="000000"/>
+                <w:kern w:val="0"/>
+                <w:szCs w:val="22"/>
+                <w:highlight w:val="lightGray"/>
+                <w:lang w:eastAsia="it-IT"/>
+                <w14:ligatures w14:val="none"/>
+              </w:rPr>
+              <w:t>Descrizione</w:t>
+            </w:r>
+          </w:p>
+        </w:tc>
+      </w:tr>
+      <w:tr>
+        <w:trPr>
+          <w:trHeight w:val="300"/>
+        </w:trPr>
+        <w:tc>
+          <w:tcPr>
+            <w:tcW w:w="480" w:type="dxa"/>
+            <w:tcBorders>
+              <w:top w:val="single" w:sz="4" w:space="0" w:color="auto"/>
+              <w:bottom w:val="nil"/>
+              <w:right w:val="single" w:sz="4" w:space="0" w:color="auto"/>
+            </w:tcBorders>
+            <w:noWrap/>
+            <w:vAlign w:val="bottom"/>
+            <w:hideMark/>
+          </w:tcPr>
+          <w:p>
+            <w:pPr>
+              <w:spacing w:before="0" w:after="0"/>
+              <w:contextualSpacing w:val="0"/>
+              <w:jc w:val="right"/>
+              <w:rPr>
+                <w:rFonts w:ascii="Calibri" w:eastAsia="Times New Roman" w:hAnsi="Calibri" w:cs="Calibri"/>
+                <w:color w:val="000000"/>
+                <w:kern w:val="0"/>
+                <w:szCs w:val="22"/>
+                <w:lang w:eastAsia="it-IT"/>
+                <w14:ligatures w14:val="none"/>
+              </w:rPr>
+            </w:pPr>
+            <w:r>
+              <w:rPr>
+                <w:rFonts w:ascii="Calibri" w:eastAsia="Times New Roman" w:hAnsi="Calibri" w:cs="Calibri"/>
+                <w:color w:val="000000"/>
+                <w:kern w:val="0"/>
+                <w:szCs w:val="22"/>
+                <w:lang w:eastAsia="it-IT"/>
+                <w14:ligatures w14:val="none"/>
+              </w:rPr>
+              <w:t>1</w:t>
+            </w:r>
+          </w:p>
+        </w:tc>
+        <w:tc>
+          <w:tcPr>
+            <w:tcW w:w="580" w:type="dxa"/>
+            <w:tcBorders>
+              <w:top w:val="single" w:sz="4" w:space="0" w:color="auto"/>
+              <w:left w:val="single" w:sz="4" w:space="0" w:color="auto"/>
+              <w:bottom w:val="nil"/>
+              <w:right w:val="single" w:sz="4" w:space="0" w:color="auto"/>
+            </w:tcBorders>
+            <w:noWrap/>
+            <w:vAlign w:val="bottom"/>
+            <w:hideMark/>
+          </w:tcPr>
+          <w:p>
+            <w:pPr>
+              <w:spacing w:before="0" w:after="0"/>
+              <w:contextualSpacing w:val="0"/>
+              <w:jc w:val="right"/>
+              <w:rPr>
+                <w:rFonts w:ascii="Calibri" w:eastAsia="Times New Roman" w:hAnsi="Calibri" w:cs="Calibri"/>
+                <w:color w:val="000000"/>
+                <w:kern w:val="0"/>
+                <w:szCs w:val="22"/>
+                <w:lang w:eastAsia="it-IT"/>
+                <w14:ligatures w14:val="none"/>
+              </w:rPr>
+            </w:pPr>
+          </w:p>
+        </w:tc>
+        <w:tc>
+          <w:tcPr>
+            <w:tcW w:w="860" w:type="dxa"/>
+            <w:tcBorders>
+              <w:top w:val="single" w:sz="4" w:space="0" w:color="auto"/>
+              <w:left w:val="single" w:sz="4" w:space="0" w:color="auto"/>
+              <w:bottom w:val="nil"/>
+              <w:right w:val="single" w:sz="4" w:space="0" w:color="auto"/>
+            </w:tcBorders>
+            <w:noWrap/>
+            <w:vAlign w:val="bottom"/>
+            <w:hideMark/>
+          </w:tcPr>
+          <w:p>
+            <w:pPr>
+              <w:spacing w:before="0" w:after="0"/>
+              <w:contextualSpacing w:val="0"/>
+              <w:rPr>
+                <w:rFonts w:ascii="Times New Roman" w:eastAsia="Times New Roman" w:hAnsi="Times New Roman" w:cs="Times New Roman"/>
+                <w:kern w:val="0"/>
+                <w:sz w:val="20"/>
+                <w:szCs w:val="20"/>
+                <w:lang w:eastAsia="it-IT"/>
+                <w14:ligatures w14:val="none"/>
+              </w:rPr>
+            </w:pPr>
+          </w:p>
+        </w:tc>
+        <w:tc>
+          <w:tcPr>
+            <w:tcW w:w="6160" w:type="dxa"/>
+            <w:tcBorders>
+              <w:top w:val="single" w:sz="4" w:space="0" w:color="auto"/>
+              <w:left w:val="single" w:sz="4" w:space="0" w:color="auto"/>
+            </w:tcBorders>
+            <w:noWrap/>
+            <w:vAlign w:val="bottom"/>
+            <w:hideMark/>
+          </w:tcPr>
+          <w:p>
+            <w:pPr>
+              <w:spacing w:before="0" w:after="0"/>
+              <w:contextualSpacing w:val="0"/>
+              <w:rPr>
+                <w:rFonts w:ascii="Calibri" w:eastAsia="Times New Roman" w:hAnsi="Calibri" w:cs="Calibri"/>
+                <w:color w:val="000000"/>
+                <w:kern w:val="0"/>
+                <w:szCs w:val="22"/>
+                <w:lang w:eastAsia="it-IT"/>
+                <w14:ligatures w14:val="none"/>
+              </w:rPr>
+            </w:pPr>
+            <w:r>
+              <w:rPr>
+                <w:rFonts w:ascii="Calibri" w:eastAsia="Times New Roman" w:hAnsi="Calibri" w:cs="Calibri"/>
+                <w:color w:val="000000"/>
+                <w:kern w:val="0"/>
+                <w:szCs w:val="22"/>
+                <w:lang w:eastAsia="it-IT"/>
+                <w14:ligatures w14:val="none"/>
+              </w:rPr>
+              <w:t>Alimentare</w:t>
+            </w:r>
+          </w:p>
+        </w:tc>
+      </w:tr>
+      <w:tr>
+        <w:trPr>
+          <w:trHeight w:val="300"/>
+        </w:trPr>
+        <w:tc>
+          <w:tcPr>
+            <w:tcW w:w="480" w:type="dxa"/>
+            <w:tcBorders>
+              <w:top w:val="nil"/>
+              <w:bottom w:val="nil"/>
+              <w:right w:val="single" w:sz="4" w:space="0" w:color="auto"/>
+            </w:tcBorders>
+            <w:noWrap/>
+            <w:vAlign w:val="bottom"/>
+            <w:hideMark/>
+          </w:tcPr>
+          <w:p>
+            <w:pPr>
+              <w:spacing w:before="0" w:after="0"/>
+              <w:contextualSpacing w:val="0"/>
+              <w:rPr>
+                <w:rFonts w:ascii="Calibri" w:eastAsia="Times New Roman" w:hAnsi="Calibri" w:cs="Calibri"/>
+                <w:color w:val="000000"/>
+                <w:kern w:val="0"/>
+                <w:szCs w:val="22"/>
+                <w:lang w:eastAsia="it-IT"/>
+                <w14:ligatures w14:val="none"/>
+              </w:rPr>
+            </w:pPr>
+          </w:p>
+        </w:tc>
+        <w:tc>
+          <w:tcPr>
+            <w:tcW w:w="580" w:type="dxa"/>
+            <w:tcBorders>
+              <w:top w:val="nil"/>
+              <w:left w:val="single" w:sz="4" w:space="0" w:color="auto"/>
+              <w:bottom w:val="nil"/>
+              <w:right w:val="single" w:sz="4" w:space="0" w:color="auto"/>
+            </w:tcBorders>
+            <w:noWrap/>
+            <w:vAlign w:val="bottom"/>
+            <w:hideMark/>
+          </w:tcPr>
+          <w:p>
+            <w:pPr>
+              <w:spacing w:before="0" w:after="0"/>
+              <w:contextualSpacing w:val="0"/>
+              <w:rPr>
+                <w:rFonts w:ascii="Calibri" w:eastAsia="Times New Roman" w:hAnsi="Calibri" w:cs="Calibri"/>
+                <w:color w:val="000000"/>
+                <w:kern w:val="0"/>
+                <w:szCs w:val="22"/>
+                <w:lang w:eastAsia="it-IT"/>
+                <w14:ligatures w14:val="none"/>
+              </w:rPr>
+            </w:pPr>
+            <w:r>
+              <w:rPr>
+                <w:rFonts w:ascii="Calibri" w:eastAsia="Times New Roman" w:hAnsi="Calibri" w:cs="Calibri"/>
+                <w:color w:val="000000"/>
+                <w:kern w:val="0"/>
+                <w:szCs w:val="22"/>
+                <w:lang w:eastAsia="it-IT"/>
+                <w14:ligatures w14:val="none"/>
+              </w:rPr>
+              <w:t>01.01</w:t>
+            </w:r>
+          </w:p>
+        </w:tc>
+        <w:tc>
+          <w:tcPr>
+            <w:tcW w:w="860" w:type="dxa"/>
+            <w:tcBorders>
+              <w:top w:val="nil"/>
+              <w:left w:val="single" w:sz="4" w:space="0" w:color="auto"/>
+              <w:bottom w:val="nil"/>
+              <w:right w:val="single" w:sz="4" w:space="0" w:color="auto"/>
+            </w:tcBorders>
+            <w:noWrap/>
+            <w:vAlign w:val="bottom"/>
+            <w:hideMark/>
+          </w:tcPr>
+          <w:p>
+            <w:pPr>
+              <w:spacing w:before="0" w:after="0"/>
+              <w:contextualSpacing w:val="0"/>
+              <w:rPr>
+                <w:rFonts w:ascii="Calibri" w:eastAsia="Times New Roman" w:hAnsi="Calibri" w:cs="Calibri"/>
+                <w:color w:val="000000"/>
+                <w:kern w:val="0"/>
+                <w:szCs w:val="22"/>
+                <w:lang w:eastAsia="it-IT"/>
+                <w14:ligatures w14:val="none"/>
+              </w:rPr>
+            </w:pPr>
+          </w:p>
+        </w:tc>
+        <w:tc>
+          <w:tcPr>
+            <w:tcW w:w="6160" w:type="dxa"/>
+            <w:tcBorders>
+              <w:left w:val="single" w:sz="4" w:space="0" w:color="auto"/>
+            </w:tcBorders>
+            <w:noWrap/>
+            <w:vAlign w:val="bottom"/>
+            <w:hideMark/>
+          </w:tcPr>
+          <w:p>
+            <w:pPr>
+              <w:spacing w:before="0" w:after="0"/>
+              <w:contextualSpacing w:val="0"/>
+              <w:rPr>
+                <w:rFonts w:ascii="Calibri" w:eastAsia="Times New Roman" w:hAnsi="Calibri" w:cs="Calibri"/>
+                <w:color w:val="000000"/>
+                <w:kern w:val="0"/>
+                <w:szCs w:val="22"/>
+                <w:lang w:eastAsia="it-IT"/>
+                <w14:ligatures w14:val="none"/>
+              </w:rPr>
+            </w:pPr>
+            <w:r>
+              <w:rPr>
+                <w:rFonts w:ascii="Calibri" w:eastAsia="Times New Roman" w:hAnsi="Calibri" w:cs="Calibri"/>
+                <w:color w:val="000000"/>
+                <w:kern w:val="0"/>
+                <w:szCs w:val="22"/>
+                <w:lang w:eastAsia="it-IT"/>
+                <w14:ligatures w14:val="none"/>
+              </w:rPr>
+              <w:t>Spese alimentari (</w:t>
+            </w:r>
+            <w:proofErr w:type="spellStart"/>
+            <w:r>
+              <w:rPr>
+                <w:rFonts w:ascii="Calibri" w:eastAsia="Times New Roman" w:hAnsi="Calibri" w:cs="Calibri"/>
+                <w:color w:val="000000"/>
+                <w:kern w:val="0"/>
+                <w:szCs w:val="22"/>
+                <w:lang w:eastAsia="it-IT"/>
+                <w14:ligatures w14:val="none"/>
+              </w:rPr>
+              <w:t>titancoop</w:t>
+            </w:r>
+            <w:proofErr w:type="spellEnd"/>
+            <w:r>
+              <w:rPr>
+                <w:rFonts w:ascii="Calibri" w:eastAsia="Times New Roman" w:hAnsi="Calibri" w:cs="Calibri"/>
+                <w:color w:val="000000"/>
+                <w:kern w:val="0"/>
+                <w:szCs w:val="22"/>
+                <w:lang w:eastAsia="it-IT"/>
+                <w14:ligatures w14:val="none"/>
+              </w:rPr>
+              <w:t>, Baguette, etc..)</w:t>
+            </w:r>
+          </w:p>
+        </w:tc>
+      </w:tr>
+      <w:tr>
+        <w:trPr>
+          <w:trHeight w:val="300"/>
+        </w:trPr>
+        <w:tc>
+          <w:tcPr>
+            <w:tcW w:w="480" w:type="dxa"/>
+            <w:tcBorders>
+              <w:top w:val="nil"/>
+              <w:bottom w:val="nil"/>
+              <w:right w:val="single" w:sz="4" w:space="0" w:color="auto"/>
+            </w:tcBorders>
+            <w:noWrap/>
+            <w:vAlign w:val="bottom"/>
+            <w:hideMark/>
+          </w:tcPr>
+          <w:p>
+            <w:pPr>
+              <w:spacing w:before="0" w:after="0"/>
+              <w:contextualSpacing w:val="0"/>
+              <w:rPr>
+                <w:rFonts w:ascii="Calibri" w:eastAsia="Times New Roman" w:hAnsi="Calibri" w:cs="Calibri"/>
+                <w:color w:val="000000"/>
+                <w:kern w:val="0"/>
+                <w:szCs w:val="22"/>
+                <w:lang w:eastAsia="it-IT"/>
+                <w14:ligatures w14:val="none"/>
+              </w:rPr>
+            </w:pPr>
+          </w:p>
+        </w:tc>
+        <w:tc>
+          <w:tcPr>
+            <w:tcW w:w="580" w:type="dxa"/>
+            <w:tcBorders>
+              <w:top w:val="nil"/>
+              <w:left w:val="single" w:sz="4" w:space="0" w:color="auto"/>
+              <w:bottom w:val="nil"/>
+              <w:right w:val="single" w:sz="4" w:space="0" w:color="auto"/>
+            </w:tcBorders>
+            <w:noWrap/>
+            <w:vAlign w:val="bottom"/>
+            <w:hideMark/>
+          </w:tcPr>
+          <w:p>
+            <w:pPr>
+              <w:spacing w:before="0" w:after="0"/>
+              <w:contextualSpacing w:val="0"/>
+              <w:rPr>
+                <w:rFonts w:ascii="Calibri" w:eastAsia="Times New Roman" w:hAnsi="Calibri" w:cs="Calibri"/>
+                <w:color w:val="000000"/>
+                <w:kern w:val="0"/>
+                <w:szCs w:val="22"/>
+                <w:lang w:eastAsia="it-IT"/>
+                <w14:ligatures w14:val="none"/>
+              </w:rPr>
+            </w:pPr>
+            <w:r>
+              <w:rPr>
+                <w:rFonts w:ascii="Calibri" w:eastAsia="Times New Roman" w:hAnsi="Calibri" w:cs="Calibri"/>
+                <w:color w:val="000000"/>
+                <w:kern w:val="0"/>
+                <w:szCs w:val="22"/>
+                <w:lang w:eastAsia="it-IT"/>
+                <w14:ligatures w14:val="none"/>
+              </w:rPr>
+              <w:t>01.02</w:t>
+            </w:r>
+          </w:p>
+        </w:tc>
+        <w:tc>
+          <w:tcPr>
+            <w:tcW w:w="860" w:type="dxa"/>
+            <w:tcBorders>
+              <w:top w:val="nil"/>
+              <w:left w:val="single" w:sz="4" w:space="0" w:color="auto"/>
+              <w:bottom w:val="nil"/>
+              <w:right w:val="single" w:sz="4" w:space="0" w:color="auto"/>
+            </w:tcBorders>
+            <w:noWrap/>
+            <w:vAlign w:val="bottom"/>
+            <w:hideMark/>
+          </w:tcPr>
+          <w:p>
+            <w:pPr>
+              <w:spacing w:before="0" w:after="0"/>
+              <w:contextualSpacing w:val="0"/>
+              <w:rPr>
+                <w:rFonts w:ascii="Calibri" w:eastAsia="Times New Roman" w:hAnsi="Calibri" w:cs="Calibri"/>
+                <w:color w:val="000000"/>
+                <w:kern w:val="0"/>
+                <w:szCs w:val="22"/>
+                <w:lang w:eastAsia="it-IT"/>
+                <w14:ligatures w14:val="none"/>
+              </w:rPr>
+            </w:pPr>
+          </w:p>
+        </w:tc>
+        <w:tc>
+          <w:tcPr>
+            <w:tcW w:w="6160" w:type="dxa"/>
+            <w:tcBorders>
+              <w:left w:val="single" w:sz="4" w:space="0" w:color="auto"/>
+            </w:tcBorders>
+            <w:noWrap/>
+            <w:vAlign w:val="bottom"/>
+            <w:hideMark/>
+          </w:tcPr>
+          <w:p>
+            <w:pPr>
+              <w:spacing w:before="0" w:after="0"/>
+              <w:contextualSpacing w:val="0"/>
+              <w:rPr>
+                <w:rFonts w:ascii="Calibri" w:eastAsia="Times New Roman" w:hAnsi="Calibri" w:cs="Calibri"/>
+                <w:color w:val="000000"/>
+                <w:kern w:val="0"/>
+                <w:szCs w:val="22"/>
+                <w:lang w:eastAsia="it-IT"/>
+                <w14:ligatures w14:val="none"/>
+              </w:rPr>
+            </w:pPr>
+            <w:r>
+              <w:rPr>
+                <w:rFonts w:ascii="Calibri" w:eastAsia="Times New Roman" w:hAnsi="Calibri" w:cs="Calibri"/>
+                <w:color w:val="000000"/>
+                <w:kern w:val="0"/>
+                <w:szCs w:val="22"/>
+                <w:lang w:eastAsia="it-IT"/>
+                <w14:ligatures w14:val="none"/>
+              </w:rPr>
+              <w:t>cene e ristoranti</w:t>
+            </w:r>
+          </w:p>
+        </w:tc>
+      </w:tr>
+      <w:tr>
+        <w:trPr>
+          <w:trHeight w:val="300"/>
+        </w:trPr>
+        <w:tc>
+          <w:tcPr>
+            <w:tcW w:w="480" w:type="dxa"/>
+            <w:tcBorders>
+              <w:top w:val="nil"/>
+              <w:bottom w:val="nil"/>
+              <w:right w:val="single" w:sz="4" w:space="0" w:color="auto"/>
+            </w:tcBorders>
+            <w:noWrap/>
+            <w:vAlign w:val="bottom"/>
+            <w:hideMark/>
+          </w:tcPr>
+          <w:p>
+            <w:pPr>
+              <w:spacing w:before="0" w:after="0"/>
+              <w:contextualSpacing w:val="0"/>
+              <w:jc w:val="right"/>
+              <w:rPr>
+                <w:rFonts w:ascii="Calibri" w:eastAsia="Times New Roman" w:hAnsi="Calibri" w:cs="Calibri"/>
+                <w:color w:val="000000"/>
+                <w:kern w:val="0"/>
+                <w:szCs w:val="22"/>
+                <w:lang w:eastAsia="it-IT"/>
+                <w14:ligatures w14:val="none"/>
+              </w:rPr>
+            </w:pPr>
+            <w:r>
+              <w:rPr>
+                <w:rFonts w:ascii="Calibri" w:eastAsia="Times New Roman" w:hAnsi="Calibri" w:cs="Calibri"/>
+                <w:color w:val="000000"/>
+                <w:kern w:val="0"/>
+                <w:szCs w:val="22"/>
+                <w:lang w:eastAsia="it-IT"/>
+                <w14:ligatures w14:val="none"/>
+              </w:rPr>
+              <w:t>2</w:t>
+            </w:r>
+          </w:p>
+        </w:tc>
+        <w:tc>
+          <w:tcPr>
+            <w:tcW w:w="580" w:type="dxa"/>
+            <w:tcBorders>
+              <w:top w:val="nil"/>
+              <w:left w:val="single" w:sz="4" w:space="0" w:color="auto"/>
+              <w:bottom w:val="nil"/>
+              <w:right w:val="single" w:sz="4" w:space="0" w:color="auto"/>
+            </w:tcBorders>
+            <w:noWrap/>
+            <w:vAlign w:val="bottom"/>
+            <w:hideMark/>
+          </w:tcPr>
+          <w:p>
+            <w:pPr>
+              <w:spacing w:before="0" w:after="0"/>
+              <w:contextualSpacing w:val="0"/>
+              <w:jc w:val="right"/>
+              <w:rPr>
+                <w:rFonts w:ascii="Calibri" w:eastAsia="Times New Roman" w:hAnsi="Calibri" w:cs="Calibri"/>
+                <w:color w:val="000000"/>
+                <w:kern w:val="0"/>
+                <w:szCs w:val="22"/>
+                <w:lang w:eastAsia="it-IT"/>
+                <w14:ligatures w14:val="none"/>
+              </w:rPr>
+            </w:pPr>
+          </w:p>
+        </w:tc>
+        <w:tc>
+          <w:tcPr>
+            <w:tcW w:w="860" w:type="dxa"/>
+            <w:tcBorders>
+              <w:top w:val="nil"/>
+              <w:left w:val="single" w:sz="4" w:space="0" w:color="auto"/>
+              <w:bottom w:val="nil"/>
+              <w:right w:val="single" w:sz="4" w:space="0" w:color="auto"/>
+            </w:tcBorders>
+            <w:noWrap/>
+            <w:vAlign w:val="bottom"/>
+            <w:hideMark/>
+          </w:tcPr>
+          <w:p>
+            <w:pPr>
+              <w:spacing w:before="0" w:after="0"/>
+              <w:contextualSpacing w:val="0"/>
+              <w:rPr>
+                <w:rFonts w:ascii="Times New Roman" w:eastAsia="Times New Roman" w:hAnsi="Times New Roman" w:cs="Times New Roman"/>
+                <w:kern w:val="0"/>
+                <w:sz w:val="20"/>
+                <w:szCs w:val="20"/>
+                <w:lang w:eastAsia="it-IT"/>
+                <w14:ligatures w14:val="none"/>
+              </w:rPr>
+            </w:pPr>
+          </w:p>
+        </w:tc>
+        <w:tc>
+          <w:tcPr>
+            <w:tcW w:w="6160" w:type="dxa"/>
+            <w:tcBorders>
+              <w:left w:val="single" w:sz="4" w:space="0" w:color="auto"/>
+            </w:tcBorders>
+            <w:noWrap/>
+            <w:vAlign w:val="bottom"/>
+            <w:hideMark/>
+          </w:tcPr>
+          <w:p>
+            <w:pPr>
+              <w:spacing w:before="0" w:after="0"/>
+              <w:contextualSpacing w:val="0"/>
+              <w:rPr>
+                <w:rFonts w:ascii="Calibri" w:eastAsia="Times New Roman" w:hAnsi="Calibri" w:cs="Calibri"/>
+                <w:color w:val="000000"/>
+                <w:kern w:val="0"/>
+                <w:szCs w:val="22"/>
+                <w:lang w:eastAsia="it-IT"/>
+                <w14:ligatures w14:val="none"/>
+              </w:rPr>
+            </w:pPr>
+            <w:r>
+              <w:rPr>
+                <w:rFonts w:ascii="Calibri" w:eastAsia="Times New Roman" w:hAnsi="Calibri" w:cs="Calibri"/>
+                <w:color w:val="000000"/>
+                <w:kern w:val="0"/>
+                <w:szCs w:val="22"/>
+                <w:lang w:eastAsia="it-IT"/>
+                <w14:ligatures w14:val="none"/>
+              </w:rPr>
+              <w:t>Automezzi</w:t>
+            </w:r>
+          </w:p>
+        </w:tc>
+      </w:tr>
+      <w:tr>
+        <w:trPr>
+          <w:trHeight w:val="300"/>
+        </w:trPr>
+        <w:tc>
+          <w:tcPr>
+            <w:tcW w:w="480" w:type="dxa"/>
+            <w:tcBorders>
+              <w:top w:val="nil"/>
+              <w:bottom w:val="nil"/>
+              <w:right w:val="single" w:sz="4" w:space="0" w:color="auto"/>
+            </w:tcBorders>
+            <w:noWrap/>
+            <w:vAlign w:val="bottom"/>
+            <w:hideMark/>
+          </w:tcPr>
+          <w:p>
+            <w:pPr>
+              <w:spacing w:before="0" w:after="0"/>
+              <w:contextualSpacing w:val="0"/>
+              <w:rPr>
+                <w:rFonts w:ascii="Calibri" w:eastAsia="Times New Roman" w:hAnsi="Calibri" w:cs="Calibri"/>
+                <w:color w:val="000000"/>
+                <w:kern w:val="0"/>
+                <w:szCs w:val="22"/>
+                <w:lang w:eastAsia="it-IT"/>
+                <w14:ligatures w14:val="none"/>
+              </w:rPr>
+            </w:pPr>
+          </w:p>
+        </w:tc>
+        <w:tc>
+          <w:tcPr>
+            <w:tcW w:w="580" w:type="dxa"/>
+            <w:tcBorders>
+              <w:top w:val="nil"/>
+              <w:left w:val="single" w:sz="4" w:space="0" w:color="auto"/>
+              <w:bottom w:val="nil"/>
+              <w:right w:val="single" w:sz="4" w:space="0" w:color="auto"/>
+            </w:tcBorders>
+            <w:noWrap/>
+            <w:vAlign w:val="bottom"/>
+            <w:hideMark/>
+          </w:tcPr>
+          <w:p>
+            <w:pPr>
+              <w:spacing w:before="0" w:after="0"/>
+              <w:contextualSpacing w:val="0"/>
+              <w:rPr>
+                <w:rFonts w:ascii="Calibri" w:eastAsia="Times New Roman" w:hAnsi="Calibri" w:cs="Calibri"/>
+                <w:color w:val="000000"/>
+                <w:kern w:val="0"/>
+                <w:szCs w:val="22"/>
+                <w:lang w:eastAsia="it-IT"/>
+                <w14:ligatures w14:val="none"/>
+              </w:rPr>
+            </w:pPr>
+            <w:r>
+              <w:rPr>
+                <w:rFonts w:ascii="Calibri" w:eastAsia="Times New Roman" w:hAnsi="Calibri" w:cs="Calibri"/>
+                <w:color w:val="000000"/>
+                <w:kern w:val="0"/>
+                <w:szCs w:val="22"/>
+                <w:lang w:eastAsia="it-IT"/>
+                <w14:ligatures w14:val="none"/>
+              </w:rPr>
+              <w:t>02.01</w:t>
+            </w:r>
+          </w:p>
+        </w:tc>
+        <w:tc>
+          <w:tcPr>
+            <w:tcW w:w="860" w:type="dxa"/>
+            <w:tcBorders>
+              <w:top w:val="nil"/>
+              <w:left w:val="single" w:sz="4" w:space="0" w:color="auto"/>
+              <w:bottom w:val="nil"/>
+              <w:right w:val="single" w:sz="4" w:space="0" w:color="auto"/>
+            </w:tcBorders>
+            <w:noWrap/>
+            <w:vAlign w:val="bottom"/>
+            <w:hideMark/>
+          </w:tcPr>
+          <w:p>
+            <w:pPr>
+              <w:spacing w:before="0" w:after="0"/>
+              <w:contextualSpacing w:val="0"/>
+              <w:rPr>
+                <w:rFonts w:ascii="Calibri" w:eastAsia="Times New Roman" w:hAnsi="Calibri" w:cs="Calibri"/>
+                <w:color w:val="000000"/>
+                <w:kern w:val="0"/>
+                <w:szCs w:val="22"/>
+                <w:lang w:eastAsia="it-IT"/>
+                <w14:ligatures w14:val="none"/>
+              </w:rPr>
+            </w:pPr>
+          </w:p>
+        </w:tc>
+        <w:tc>
+          <w:tcPr>
+            <w:tcW w:w="6160" w:type="dxa"/>
+            <w:tcBorders>
+              <w:left w:val="single" w:sz="4" w:space="0" w:color="auto"/>
+            </w:tcBorders>
+            <w:noWrap/>
+            <w:vAlign w:val="bottom"/>
+            <w:hideMark/>
+          </w:tcPr>
+          <w:p>
+            <w:pPr>
+              <w:spacing w:before="0" w:after="0"/>
+              <w:contextualSpacing w:val="0"/>
+              <w:rPr>
+                <w:rFonts w:ascii="Calibri" w:eastAsia="Times New Roman" w:hAnsi="Calibri" w:cs="Calibri"/>
+                <w:color w:val="000000"/>
+                <w:kern w:val="0"/>
+                <w:szCs w:val="22"/>
+                <w:lang w:eastAsia="it-IT"/>
+                <w14:ligatures w14:val="none"/>
+              </w:rPr>
+            </w:pPr>
+            <w:r>
+              <w:rPr>
+                <w:rFonts w:ascii="Calibri" w:eastAsia="Times New Roman" w:hAnsi="Calibri" w:cs="Calibri"/>
+                <w:color w:val="000000"/>
+                <w:kern w:val="0"/>
+                <w:szCs w:val="22"/>
+                <w:lang w:eastAsia="it-IT"/>
+                <w14:ligatures w14:val="none"/>
+              </w:rPr>
+              <w:t>Auto AUDI</w:t>
+            </w:r>
+          </w:p>
+        </w:tc>
+      </w:tr>
+      <w:tr>
+        <w:trPr>
+          <w:trHeight w:val="300"/>
+        </w:trPr>
+        <w:tc>
+          <w:tcPr>
+            <w:tcW w:w="480" w:type="dxa"/>
+            <w:tcBorders>
+              <w:top w:val="nil"/>
+              <w:bottom w:val="nil"/>
+              <w:right w:val="single" w:sz="4" w:space="0" w:color="auto"/>
+            </w:tcBorders>
+            <w:noWrap/>
+            <w:vAlign w:val="bottom"/>
+            <w:hideMark/>
+          </w:tcPr>
+          <w:p>
+            <w:pPr>
+              <w:spacing w:before="0" w:after="0"/>
+              <w:contextualSpacing w:val="0"/>
+              <w:rPr>
+                <w:rFonts w:ascii="Calibri" w:eastAsia="Times New Roman" w:hAnsi="Calibri" w:cs="Calibri"/>
+                <w:color w:val="000000"/>
+                <w:kern w:val="0"/>
+                <w:szCs w:val="22"/>
+                <w:lang w:eastAsia="it-IT"/>
+                <w14:ligatures w14:val="none"/>
+              </w:rPr>
+            </w:pPr>
+          </w:p>
+        </w:tc>
+        <w:tc>
+          <w:tcPr>
+            <w:tcW w:w="580" w:type="dxa"/>
+            <w:tcBorders>
+              <w:top w:val="nil"/>
+              <w:left w:val="single" w:sz="4" w:space="0" w:color="auto"/>
+              <w:bottom w:val="nil"/>
+              <w:right w:val="single" w:sz="4" w:space="0" w:color="auto"/>
+            </w:tcBorders>
+            <w:noWrap/>
+            <w:vAlign w:val="bottom"/>
+            <w:hideMark/>
+          </w:tcPr>
+          <w:p>
+            <w:pPr>
+              <w:spacing w:before="0" w:after="0"/>
+              <w:contextualSpacing w:val="0"/>
+              <w:rPr>
+                <w:rFonts w:ascii="Times New Roman" w:eastAsia="Times New Roman" w:hAnsi="Times New Roman" w:cs="Times New Roman"/>
+                <w:kern w:val="0"/>
+                <w:sz w:val="20"/>
+                <w:szCs w:val="20"/>
+                <w:lang w:eastAsia="it-IT"/>
+                <w14:ligatures w14:val="none"/>
+              </w:rPr>
+            </w:pPr>
+          </w:p>
+        </w:tc>
+        <w:tc>
+          <w:tcPr>
+            <w:tcW w:w="860" w:type="dxa"/>
+            <w:tcBorders>
+              <w:top w:val="nil"/>
+              <w:left w:val="single" w:sz="4" w:space="0" w:color="auto"/>
+              <w:bottom w:val="nil"/>
+              <w:right w:val="single" w:sz="4" w:space="0" w:color="auto"/>
+            </w:tcBorders>
+            <w:noWrap/>
+            <w:vAlign w:val="bottom"/>
+            <w:hideMark/>
+          </w:tcPr>
+          <w:p>
+            <w:pPr>
+              <w:spacing w:before="0" w:after="0"/>
+              <w:contextualSpacing w:val="0"/>
+              <w:rPr>
+                <w:rFonts w:ascii="Calibri" w:eastAsia="Times New Roman" w:hAnsi="Calibri" w:cs="Calibri"/>
+                <w:color w:val="000000"/>
+                <w:kern w:val="0"/>
+                <w:szCs w:val="22"/>
+                <w:lang w:eastAsia="it-IT"/>
+                <w14:ligatures w14:val="none"/>
+              </w:rPr>
+            </w:pPr>
+            <w:r>
+              <w:rPr>
+                <w:rFonts w:ascii="Calibri" w:eastAsia="Times New Roman" w:hAnsi="Calibri" w:cs="Calibri"/>
+                <w:color w:val="000000"/>
+                <w:kern w:val="0"/>
+                <w:szCs w:val="22"/>
+                <w:lang w:eastAsia="it-IT"/>
+                <w14:ligatures w14:val="none"/>
+              </w:rPr>
+              <w:t>02.01.01</w:t>
+            </w:r>
+          </w:p>
+        </w:tc>
+        <w:tc>
+          <w:tcPr>
+            <w:tcW w:w="6160" w:type="dxa"/>
+            <w:tcBorders>
+              <w:left w:val="single" w:sz="4" w:space="0" w:color="auto"/>
+            </w:tcBorders>
+            <w:noWrap/>
+            <w:vAlign w:val="bottom"/>
+            <w:hideMark/>
+          </w:tcPr>
+          <w:p>
+            <w:pPr>
+              <w:spacing w:before="0" w:after="0"/>
+              <w:contextualSpacing w:val="0"/>
+              <w:rPr>
+                <w:rFonts w:ascii="Calibri" w:eastAsia="Times New Roman" w:hAnsi="Calibri" w:cs="Calibri"/>
+                <w:color w:val="000000"/>
+                <w:kern w:val="0"/>
+                <w:szCs w:val="22"/>
+                <w:lang w:eastAsia="it-IT"/>
+                <w14:ligatures w14:val="none"/>
+              </w:rPr>
+            </w:pPr>
+            <w:r>
+              <w:rPr>
+                <w:rFonts w:ascii="Calibri" w:eastAsia="Times New Roman" w:hAnsi="Calibri" w:cs="Calibri"/>
+                <w:color w:val="000000"/>
+                <w:kern w:val="0"/>
+                <w:szCs w:val="22"/>
+                <w:lang w:eastAsia="it-IT"/>
+                <w14:ligatures w14:val="none"/>
+              </w:rPr>
+              <w:t>Benzina e/o gasolio</w:t>
+            </w:r>
+          </w:p>
+        </w:tc>
+      </w:tr>
+      <w:tr>
+        <w:trPr>
+          <w:trHeight w:val="300"/>
+        </w:trPr>
+        <w:tc>
+          <w:tcPr>
+            <w:tcW w:w="480" w:type="dxa"/>
+            <w:tcBorders>
+              <w:top w:val="nil"/>
+              <w:bottom w:val="nil"/>
+              <w:right w:val="single" w:sz="4" w:space="0" w:color="auto"/>
+            </w:tcBorders>
+            <w:noWrap/>
+            <w:vAlign w:val="bottom"/>
+            <w:hideMark/>
+          </w:tcPr>
+          <w:p>
+            <w:pPr>
+              <w:spacing w:before="0" w:after="0"/>
+              <w:contextualSpacing w:val="0"/>
+              <w:rPr>
+                <w:rFonts w:ascii="Calibri" w:eastAsia="Times New Roman" w:hAnsi="Calibri" w:cs="Calibri"/>
+                <w:color w:val="000000"/>
+                <w:kern w:val="0"/>
+                <w:szCs w:val="22"/>
+                <w:lang w:eastAsia="it-IT"/>
+                <w14:ligatures w14:val="none"/>
+              </w:rPr>
+            </w:pPr>
+          </w:p>
+        </w:tc>
+        <w:tc>
+          <w:tcPr>
+            <w:tcW w:w="580" w:type="dxa"/>
+            <w:tcBorders>
+              <w:top w:val="nil"/>
+              <w:left w:val="single" w:sz="4" w:space="0" w:color="auto"/>
+              <w:bottom w:val="nil"/>
+              <w:right w:val="single" w:sz="4" w:space="0" w:color="auto"/>
+            </w:tcBorders>
+            <w:noWrap/>
+            <w:vAlign w:val="bottom"/>
+            <w:hideMark/>
+          </w:tcPr>
+          <w:p>
+            <w:pPr>
+              <w:spacing w:before="0" w:after="0"/>
+              <w:contextualSpacing w:val="0"/>
+              <w:rPr>
+                <w:rFonts w:ascii="Times New Roman" w:eastAsia="Times New Roman" w:hAnsi="Times New Roman" w:cs="Times New Roman"/>
+                <w:kern w:val="0"/>
+                <w:sz w:val="20"/>
+                <w:szCs w:val="20"/>
+                <w:lang w:eastAsia="it-IT"/>
+                <w14:ligatures w14:val="none"/>
+              </w:rPr>
+            </w:pPr>
+          </w:p>
+        </w:tc>
+        <w:tc>
+          <w:tcPr>
+            <w:tcW w:w="860" w:type="dxa"/>
+            <w:tcBorders>
+              <w:top w:val="nil"/>
+              <w:left w:val="single" w:sz="4" w:space="0" w:color="auto"/>
+              <w:bottom w:val="nil"/>
+              <w:right w:val="single" w:sz="4" w:space="0" w:color="auto"/>
+            </w:tcBorders>
+            <w:noWrap/>
+            <w:vAlign w:val="bottom"/>
+            <w:hideMark/>
+          </w:tcPr>
+          <w:p>
+            <w:pPr>
+              <w:spacing w:before="0" w:after="0"/>
+              <w:contextualSpacing w:val="0"/>
+              <w:rPr>
+                <w:rFonts w:ascii="Calibri" w:eastAsia="Times New Roman" w:hAnsi="Calibri" w:cs="Calibri"/>
+                <w:color w:val="000000"/>
+                <w:kern w:val="0"/>
+                <w:szCs w:val="22"/>
+                <w:lang w:eastAsia="it-IT"/>
+                <w14:ligatures w14:val="none"/>
+              </w:rPr>
+            </w:pPr>
+            <w:r>
+              <w:rPr>
+                <w:rFonts w:ascii="Calibri" w:eastAsia="Times New Roman" w:hAnsi="Calibri" w:cs="Calibri"/>
+                <w:color w:val="000000"/>
+                <w:kern w:val="0"/>
+                <w:szCs w:val="22"/>
+                <w:lang w:eastAsia="it-IT"/>
+                <w14:ligatures w14:val="none"/>
+              </w:rPr>
+              <w:t>02.01.03</w:t>
+            </w:r>
+          </w:p>
+        </w:tc>
+        <w:tc>
+          <w:tcPr>
+            <w:tcW w:w="6160" w:type="dxa"/>
+            <w:tcBorders>
+              <w:left w:val="single" w:sz="4" w:space="0" w:color="auto"/>
+            </w:tcBorders>
+            <w:noWrap/>
+            <w:vAlign w:val="bottom"/>
+            <w:hideMark/>
+          </w:tcPr>
+          <w:p>
+            <w:pPr>
+              <w:spacing w:before="0" w:after="0"/>
+              <w:contextualSpacing w:val="0"/>
+              <w:rPr>
+                <w:rFonts w:ascii="Calibri" w:eastAsia="Times New Roman" w:hAnsi="Calibri" w:cs="Calibri"/>
+                <w:color w:val="000000"/>
+                <w:kern w:val="0"/>
+                <w:szCs w:val="22"/>
+                <w:lang w:eastAsia="it-IT"/>
+                <w14:ligatures w14:val="none"/>
+              </w:rPr>
+            </w:pPr>
+            <w:r>
+              <w:rPr>
+                <w:rFonts w:ascii="Calibri" w:eastAsia="Times New Roman" w:hAnsi="Calibri" w:cs="Calibri"/>
+                <w:color w:val="000000"/>
+                <w:kern w:val="0"/>
+                <w:szCs w:val="22"/>
+                <w:lang w:eastAsia="it-IT"/>
+                <w14:ligatures w14:val="none"/>
+              </w:rPr>
+              <w:t>Revisione e/o bollo</w:t>
+            </w:r>
+          </w:p>
+        </w:tc>
+      </w:tr>
+      <w:tr>
+        <w:trPr>
+          <w:trHeight w:val="300"/>
+        </w:trPr>
+        <w:tc>
+          <w:tcPr>
+            <w:tcW w:w="480" w:type="dxa"/>
+            <w:tcBorders>
+              <w:top w:val="nil"/>
+              <w:bottom w:val="single" w:sz="4" w:space="0" w:color="auto"/>
+              <w:right w:val="single" w:sz="4" w:space="0" w:color="auto"/>
+            </w:tcBorders>
+            <w:noWrap/>
+            <w:vAlign w:val="bottom"/>
+            <w:hideMark/>
+          </w:tcPr>
+          <w:p>
+            <w:pPr>
+              <w:spacing w:before="0" w:after="0"/>
+              <w:contextualSpacing w:val="0"/>
+              <w:rPr>
+                <w:rFonts w:ascii="Calibri" w:eastAsia="Times New Roman" w:hAnsi="Calibri" w:cs="Calibri"/>
+                <w:color w:val="000000"/>
+                <w:kern w:val="0"/>
+                <w:szCs w:val="22"/>
+                <w:lang w:eastAsia="it-IT"/>
+                <w14:ligatures w14:val="none"/>
+              </w:rPr>
+            </w:pPr>
+          </w:p>
+        </w:tc>
+        <w:tc>
+          <w:tcPr>
+            <w:tcW w:w="580" w:type="dxa"/>
+            <w:tcBorders>
+              <w:top w:val="nil"/>
+              <w:left w:val="single" w:sz="4" w:space="0" w:color="auto"/>
+              <w:bottom w:val="single" w:sz="4" w:space="0" w:color="auto"/>
+              <w:right w:val="single" w:sz="4" w:space="0" w:color="auto"/>
+            </w:tcBorders>
+            <w:noWrap/>
+            <w:vAlign w:val="bottom"/>
+            <w:hideMark/>
+          </w:tcPr>
+          <w:p>
+            <w:pPr>
+              <w:spacing w:before="0" w:after="0"/>
+              <w:contextualSpacing w:val="0"/>
+              <w:rPr>
+                <w:rFonts w:ascii="Times New Roman" w:eastAsia="Times New Roman" w:hAnsi="Times New Roman" w:cs="Times New Roman"/>
+                <w:kern w:val="0"/>
+                <w:sz w:val="20"/>
+                <w:szCs w:val="20"/>
+                <w:lang w:eastAsia="it-IT"/>
+                <w14:ligatures w14:val="none"/>
+              </w:rPr>
+            </w:pPr>
+          </w:p>
+        </w:tc>
+        <w:tc>
+          <w:tcPr>
+            <w:tcW w:w="860" w:type="dxa"/>
+            <w:tcBorders>
+              <w:top w:val="nil"/>
+              <w:left w:val="single" w:sz="4" w:space="0" w:color="auto"/>
+              <w:bottom w:val="single" w:sz="4" w:space="0" w:color="auto"/>
+              <w:right w:val="single" w:sz="4" w:space="0" w:color="auto"/>
+            </w:tcBorders>
+            <w:noWrap/>
+            <w:vAlign w:val="bottom"/>
+            <w:hideMark/>
+          </w:tcPr>
+          <w:p>
+            <w:pPr>
+              <w:spacing w:before="0" w:after="0"/>
+              <w:contextualSpacing w:val="0"/>
+              <w:rPr>
+                <w:rFonts w:ascii="Calibri" w:eastAsia="Times New Roman" w:hAnsi="Calibri" w:cs="Calibri"/>
+                <w:color w:val="000000"/>
+                <w:kern w:val="0"/>
+                <w:szCs w:val="22"/>
+                <w:lang w:eastAsia="it-IT"/>
+                <w14:ligatures w14:val="none"/>
+              </w:rPr>
+            </w:pPr>
+            <w:r>
+              <w:rPr>
+                <w:rFonts w:ascii="Calibri" w:eastAsia="Times New Roman" w:hAnsi="Calibri" w:cs="Calibri"/>
+                <w:color w:val="000000"/>
+                <w:kern w:val="0"/>
+                <w:szCs w:val="22"/>
+                <w:lang w:eastAsia="it-IT"/>
+                <w14:ligatures w14:val="none"/>
+              </w:rPr>
+              <w:t>02.01.04</w:t>
+            </w:r>
+          </w:p>
+        </w:tc>
+        <w:tc>
+          <w:tcPr>
+            <w:tcW w:w="6160" w:type="dxa"/>
+            <w:tcBorders>
+              <w:left w:val="single" w:sz="4" w:space="0" w:color="auto"/>
+            </w:tcBorders>
+            <w:noWrap/>
+            <w:vAlign w:val="bottom"/>
+            <w:hideMark/>
+          </w:tcPr>
+          <w:p>
+            <w:pPr>
+              <w:spacing w:before="0" w:after="0"/>
+              <w:contextualSpacing w:val="0"/>
+              <w:rPr>
+                <w:rFonts w:ascii="Calibri" w:eastAsia="Times New Roman" w:hAnsi="Calibri" w:cs="Calibri"/>
+                <w:color w:val="000000"/>
+                <w:kern w:val="0"/>
+                <w:szCs w:val="22"/>
+                <w:lang w:eastAsia="it-IT"/>
+                <w14:ligatures w14:val="none"/>
+              </w:rPr>
+            </w:pPr>
+            <w:r>
+              <w:rPr>
+                <w:rFonts w:ascii="Calibri" w:eastAsia="Times New Roman" w:hAnsi="Calibri" w:cs="Calibri"/>
+                <w:color w:val="000000"/>
+                <w:kern w:val="0"/>
+                <w:szCs w:val="22"/>
+                <w:lang w:eastAsia="it-IT"/>
+                <w14:ligatures w14:val="none"/>
+              </w:rPr>
+              <w:t>tagliando</w:t>
+            </w:r>
+          </w:p>
+        </w:tc>
+      </w:tr>
+    </w:tbl>
+    <w:p>
+      <w:r>
+        <w:tab/>
+        <w:t>Etc …</w:t>
+      </w:r>
+    </w:p>
+    <w:p/>
+    <w:p>
+      <w:r>
+        <w:t>Questa funzione è presente all’interno del visualizzatore di codici statistici cliccando sul Tab (1) “Import”, vedi esempio:</w:t>
+      </w:r>
+    </w:p>
+    <w:p>
+      <w:pPr>
+        <w:pStyle w:val="immagine"/>
+      </w:pPr>
+      <w:r>
+        <w:drawing>
+          <wp:inline distT="0" distB="0" distL="0" distR="0" wp14:anchorId="56B64A87" wp14:editId="461E6448">
+            <wp:extent cx="6115050" cy="2105025"/>
+            <wp:effectExtent l="0" t="0" r="0" b="9525"/>
+            <wp:docPr id="950925996" name="Immagine 1"/>
+            <wp:cNvGraphicFramePr>
+              <a:graphicFrameLocks xmlns:a="http://schemas.openxmlformats.org/drawingml/2006/main" noChangeAspect="1"/>
+            </wp:cNvGraphicFramePr>
+            <a:graphic xmlns:a="http://schemas.openxmlformats.org/drawingml/2006/main">
+              <a:graphicData uri="http://schemas.openxmlformats.org/drawingml/2006/picture">
+                <pic:pic xmlns:pic="http://schemas.openxmlformats.org/drawingml/2006/picture">
+                  <pic:nvPicPr>
+                    <pic:cNvPr id="0" name="Picture 1"/>
+                    <pic:cNvPicPr>
+                      <a:picLocks noChangeAspect="1" noChangeArrowheads="1"/>
+                    </pic:cNvPicPr>
+                  </pic:nvPicPr>
+                  <pic:blipFill>
+                    <a:blip r:embed="rId27">
+                      <a:extLst>
+                        <a:ext uri="{28A0092B-C50C-407E-A947-70E740481C1C}">
+                          <a14:useLocalDpi xmlns:a14="http://schemas.microsoft.com/office/drawing/2010/main" val="0"/>
+                        </a:ext>
+                      </a:extLst>
+                    </a:blip>
+                    <a:srcRect/>
+                    <a:stretch>
+                      <a:fillRect/>
+                    </a:stretch>
+                  </pic:blipFill>
+                  <pic:spPr bwMode="auto">
+                    <a:xfrm>
+                      <a:off x="0" y="0"/>
+                      <a:ext cx="6115050" cy="2105025"/>
+                    </a:xfrm>
+                    <a:prstGeom prst="rect">
+                      <a:avLst/>
+                    </a:prstGeom>
+                    <a:noFill/>
+                    <a:ln>
+                      <a:noFill/>
+                    </a:ln>
+                  </pic:spPr>
+                </pic:pic>
+              </a:graphicData>
+            </a:graphic>
+          </wp:inline>
+        </w:drawing>
+      </w:r>
+    </w:p>
+    <w:p>
+      <w:r>
+        <w:t>Dopo aver completato la redazione dei nostri codici statistici e salvato il foglio Excel in un direttorio a piacere: possiamo selezionarlo con BANCA cliccando sul bottone “Cerca…” dopo di ché possiamo eseguire l’</w:t>
+      </w:r>
+      <w:r>
+        <w:rPr>
+          <w:b/>
+        </w:rPr>
+        <w:t>import</w:t>
+      </w:r>
+      <w:r>
+        <w:t xml:space="preserve"> cliccando sul bottone (2) “import” (che diventerà abilitato dopo aver selezionato il file).</w:t>
+      </w:r>
+    </w:p>
+    <w:p>
+      <w:r>
+        <w:t xml:space="preserve">Verranno emessi dei messaggi di warning se il programma rileva che esistono già delle assegnazioni di codici. </w:t>
+      </w:r>
+      <w:proofErr w:type="gramStart"/>
+      <w:r>
+        <w:t>E’</w:t>
+      </w:r>
+      <w:proofErr w:type="gramEnd"/>
+      <w:r>
+        <w:t xml:space="preserve"> vostra scelta, a questo punto, interrompere oppure proseguire.</w:t>
+      </w:r>
+    </w:p>
+    <w:p>
+      <w:pPr>
+        <w:pStyle w:val="Titolo1"/>
+      </w:pPr>
+      <w:bookmarkStart w:id="13" w:name="_Toc225612087"/>
       <w:r>
         <w:lastRenderedPageBreak/>
         <w:t>Indovina Codici Statistici</w:t>
       </w:r>
-      <w:bookmarkEnd w:id="10"/>
+      <w:bookmarkEnd w:id="13"/>
     </w:p>
     <w:p>
       <w:pPr>
         <w:pStyle w:val="Titolo2"/>
       </w:pPr>
-      <w:bookmarkStart w:id="11" w:name="_Toc189322905"/>
+      <w:bookmarkStart w:id="14" w:name="_Toc225612088"/>
       <w:r>
         <w:t>Ricerca Codici Statistici in base alla descrizione</w:t>
       </w:r>
-      <w:bookmarkEnd w:id="11"/>
+      <w:bookmarkEnd w:id="14"/>
     </w:p>
     <w:p>
       <w:r>
@@ -3365,11 +5448,11 @@
       <w:r>
         <w:t xml:space="preserve"> (</w:t>
       </w:r>
-      <w:bookmarkStart w:id="12" w:name="_Hlk189320140"/>
+      <w:bookmarkStart w:id="15" w:name="_Hlk189320140"/>
       <w:r>
         <w:t>CdSt</w:t>
       </w:r>
-      <w:bookmarkEnd w:id="12"/>
+      <w:bookmarkEnd w:id="15"/>
       <w:r>
         <w:t xml:space="preserve">) utilizza algoritmi dell’intelligenza artificiale (AI) della branca specifica della LLM (Large Language Model). In particolare, qui, viene utilizzato per </w:t>
       </w:r>
@@ -3517,7 +5600,7 @@
                     </pic:cNvPicPr>
                   </pic:nvPicPr>
                   <pic:blipFill>
-                    <a:blip r:embed="rId27">
+                    <a:blip r:embed="rId28">
                       <a:extLst>
                         <a:ext uri="{28A0092B-C50C-407E-A947-70E740481C1C}">
                           <a14:useLocalDpi xmlns:a14="http://schemas.microsoft.com/office/drawing/2010/main" val="0"/>
@@ -3601,7 +5684,7 @@
                     <pic:cNvPicPr/>
                   </pic:nvPicPr>
                   <pic:blipFill>
-                    <a:blip r:embed="rId28"/>
+                    <a:blip r:embed="rId29"/>
                     <a:stretch>
                       <a:fillRect/>
                     </a:stretch>
@@ -3631,12 +5714,12 @@
       <w:pPr>
         <w:pStyle w:val="Titolo2"/>
       </w:pPr>
-      <w:bookmarkStart w:id="13" w:name="_Toc189322906"/>
+      <w:bookmarkStart w:id="16" w:name="_Toc225612089"/>
       <w:r>
         <w:lastRenderedPageBreak/>
         <w:t>Assegnazioni particolari</w:t>
       </w:r>
-      <w:bookmarkEnd w:id="13"/>
+      <w:bookmarkEnd w:id="16"/>
     </w:p>
     <w:p>
       <w:r>
@@ -3660,7 +5743,15 @@
         <w:t>Individuare nella finestra delle registrazioni orfane che appartengono ad un singolo CdSt</w:t>
       </w:r>
       <w:r>
-        <w:t xml:space="preserve"> (nel esempio sotto sono le righe evidenziate in azzurro)</w:t>
+        <w:t xml:space="preserve"> (</w:t>
+      </w:r>
+      <w:proofErr w:type="gramStart"/>
+      <w:r>
+        <w:t>nel esempio</w:t>
+      </w:r>
+      <w:proofErr w:type="gramEnd"/>
+      <w:r>
+        <w:t xml:space="preserve"> sotto sono le righe evidenziate in azzurro)</w:t>
       </w:r>
     </w:p>
     <w:p>
@@ -3684,7 +5775,7 @@
                     <pic:cNvPicPr/>
                   </pic:nvPicPr>
                   <pic:blipFill>
-                    <a:blip r:embed="rId29"/>
+                    <a:blip r:embed="rId30"/>
                     <a:stretch>
                       <a:fillRect/>
                     </a:stretch>
@@ -3740,7 +5831,7 @@
                     </pic:cNvPicPr>
                   </pic:nvPicPr>
                   <pic:blipFill>
-                    <a:blip r:embed="rId30">
+                    <a:blip r:embed="rId31">
                       <a:extLst>
                         <a:ext uri="{28A0092B-C50C-407E-A947-70E740481C1C}">
                           <a14:useLocalDpi xmlns:a14="http://schemas.microsoft.com/office/drawing/2010/main" val="0"/>
@@ -3808,7 +5899,7 @@
                     </pic:cNvPicPr>
                   </pic:nvPicPr>
                   <pic:blipFill>
-                    <a:blip r:embed="rId31">
+                    <a:blip r:embed="rId32">
                       <a:extLst>
                         <a:ext uri="{28A0092B-C50C-407E-A947-70E740481C1C}">
                           <a14:useLocalDpi xmlns:a14="http://schemas.microsoft.com/office/drawing/2010/main" val="0"/>
@@ -3884,7 +5975,7 @@
     <w:p/>
     <w:p/>
     <w:sectPr>
-      <w:footerReference w:type="default" r:id="rId32"/>
+      <w:footerReference w:type="default" r:id="rId33"/>
       <w:pgSz w:w="11906" w:h="16838"/>
       <w:pgMar w:top="1417" w:right="1134" w:bottom="1134" w:left="1134" w:header="708" w:footer="708" w:gutter="0"/>
       <w:cols w:space="708"/>
@@ -4013,12 +6104,14 @@
     <w:r>
       <w:ptab w:relativeTo="margin" w:alignment="right" w:leader="none"/>
     </w:r>
+    <w:proofErr w:type="gramStart"/>
     <w:r>
       <w:t xml:space="preserve">1 </w:t>
     </w:r>
     <w:r>
       <w:t>Febbraio</w:t>
     </w:r>
+    <w:proofErr w:type="gramEnd"/>
     <w:r>
       <w:t xml:space="preserve"> 2025</w:t>
     </w:r>
@@ -4366,6 +6459,119 @@
     </w:lvl>
   </w:abstractNum>
   <w:abstractNum w:abstractNumId="3" w15:restartNumberingAfterBreak="0">
+    <w:nsid w:val="0EC54157"/>
+    <w:multiLevelType w:val="hybridMultilevel"/>
+    <w:tmpl w:val="DC6EEAD8"/>
+    <w:lvl w:ilvl="0" w:tplc="04100001">
+      <w:start w:val="1"/>
+      <w:numFmt w:val="bullet"/>
+      <w:lvlText w:val=""/>
+      <w:lvlJc w:val="left"/>
+      <w:pPr>
+        <w:ind w:left="720" w:hanging="360"/>
+      </w:pPr>
+      <w:rPr>
+        <w:rFonts w:ascii="Symbol" w:hAnsi="Symbol" w:hint="default"/>
+      </w:rPr>
+    </w:lvl>
+    <w:lvl w:ilvl="1" w:tplc="04100003" w:tentative="1">
+      <w:start w:val="1"/>
+      <w:numFmt w:val="bullet"/>
+      <w:lvlText w:val="o"/>
+      <w:lvlJc w:val="left"/>
+      <w:pPr>
+        <w:ind w:left="1440" w:hanging="360"/>
+      </w:pPr>
+      <w:rPr>
+        <w:rFonts w:ascii="Courier New" w:hAnsi="Courier New" w:cs="Courier New" w:hint="default"/>
+      </w:rPr>
+    </w:lvl>
+    <w:lvl w:ilvl="2" w:tplc="04100005" w:tentative="1">
+      <w:start w:val="1"/>
+      <w:numFmt w:val="bullet"/>
+      <w:lvlText w:val=""/>
+      <w:lvlJc w:val="left"/>
+      <w:pPr>
+        <w:ind w:left="2160" w:hanging="360"/>
+      </w:pPr>
+      <w:rPr>
+        <w:rFonts w:ascii="Wingdings" w:hAnsi="Wingdings" w:hint="default"/>
+      </w:rPr>
+    </w:lvl>
+    <w:lvl w:ilvl="3" w:tplc="04100001" w:tentative="1">
+      <w:start w:val="1"/>
+      <w:numFmt w:val="bullet"/>
+      <w:lvlText w:val=""/>
+      <w:lvlJc w:val="left"/>
+      <w:pPr>
+        <w:ind w:left="2880" w:hanging="360"/>
+      </w:pPr>
+      <w:rPr>
+        <w:rFonts w:ascii="Symbol" w:hAnsi="Symbol" w:hint="default"/>
+      </w:rPr>
+    </w:lvl>
+    <w:lvl w:ilvl="4" w:tplc="04100003" w:tentative="1">
+      <w:start w:val="1"/>
+      <w:numFmt w:val="bullet"/>
+      <w:lvlText w:val="o"/>
+      <w:lvlJc w:val="left"/>
+      <w:pPr>
+        <w:ind w:left="3600" w:hanging="360"/>
+      </w:pPr>
+      <w:rPr>
+        <w:rFonts w:ascii="Courier New" w:hAnsi="Courier New" w:cs="Courier New" w:hint="default"/>
+      </w:rPr>
+    </w:lvl>
+    <w:lvl w:ilvl="5" w:tplc="04100005" w:tentative="1">
+      <w:start w:val="1"/>
+      <w:numFmt w:val="bullet"/>
+      <w:lvlText w:val=""/>
+      <w:lvlJc w:val="left"/>
+      <w:pPr>
+        <w:ind w:left="4320" w:hanging="360"/>
+      </w:pPr>
+      <w:rPr>
+        <w:rFonts w:ascii="Wingdings" w:hAnsi="Wingdings" w:hint="default"/>
+      </w:rPr>
+    </w:lvl>
+    <w:lvl w:ilvl="6" w:tplc="04100001" w:tentative="1">
+      <w:start w:val="1"/>
+      <w:numFmt w:val="bullet"/>
+      <w:lvlText w:val=""/>
+      <w:lvlJc w:val="left"/>
+      <w:pPr>
+        <w:ind w:left="5040" w:hanging="360"/>
+      </w:pPr>
+      <w:rPr>
+        <w:rFonts w:ascii="Symbol" w:hAnsi="Symbol" w:hint="default"/>
+      </w:rPr>
+    </w:lvl>
+    <w:lvl w:ilvl="7" w:tplc="04100003" w:tentative="1">
+      <w:start w:val="1"/>
+      <w:numFmt w:val="bullet"/>
+      <w:lvlText w:val="o"/>
+      <w:lvlJc w:val="left"/>
+      <w:pPr>
+        <w:ind w:left="5760" w:hanging="360"/>
+      </w:pPr>
+      <w:rPr>
+        <w:rFonts w:ascii="Courier New" w:hAnsi="Courier New" w:cs="Courier New" w:hint="default"/>
+      </w:rPr>
+    </w:lvl>
+    <w:lvl w:ilvl="8" w:tplc="04100005" w:tentative="1">
+      <w:start w:val="1"/>
+      <w:numFmt w:val="bullet"/>
+      <w:lvlText w:val=""/>
+      <w:lvlJc w:val="left"/>
+      <w:pPr>
+        <w:ind w:left="6480" w:hanging="360"/>
+      </w:pPr>
+      <w:rPr>
+        <w:rFonts w:ascii="Wingdings" w:hAnsi="Wingdings" w:hint="default"/>
+      </w:rPr>
+    </w:lvl>
+  </w:abstractNum>
+  <w:abstractNum w:abstractNumId="4" w15:restartNumberingAfterBreak="0">
     <w:nsid w:val="11342EAF"/>
     <w:multiLevelType w:val="hybridMultilevel"/>
     <w:tmpl w:val="5FC8D1C8"/>
@@ -4478,7 +6684,7 @@
       </w:rPr>
     </w:lvl>
   </w:abstractNum>
-  <w:abstractNum w:abstractNumId="4" w15:restartNumberingAfterBreak="0">
+  <w:abstractNum w:abstractNumId="5" w15:restartNumberingAfterBreak="0">
     <w:nsid w:val="12A7350F"/>
     <w:multiLevelType w:val="hybridMultilevel"/>
     <w:tmpl w:val="756E8FD4"/>
@@ -4564,7 +6770,7 @@
       </w:pPr>
     </w:lvl>
   </w:abstractNum>
-  <w:abstractNum w:abstractNumId="5" w15:restartNumberingAfterBreak="0">
+  <w:abstractNum w:abstractNumId="6" w15:restartNumberingAfterBreak="0">
     <w:nsid w:val="1613185D"/>
     <w:multiLevelType w:val="hybridMultilevel"/>
     <w:tmpl w:val="4ECC7E7C"/>
@@ -4650,7 +6856,7 @@
       </w:pPr>
     </w:lvl>
   </w:abstractNum>
-  <w:abstractNum w:abstractNumId="6" w15:restartNumberingAfterBreak="0">
+  <w:abstractNum w:abstractNumId="7" w15:restartNumberingAfterBreak="0">
     <w:nsid w:val="26681B65"/>
     <w:multiLevelType w:val="hybridMultilevel"/>
     <w:tmpl w:val="4E40627E"/>
@@ -4736,7 +6942,7 @@
       </w:pPr>
     </w:lvl>
   </w:abstractNum>
-  <w:abstractNum w:abstractNumId="7" w15:restartNumberingAfterBreak="0">
+  <w:abstractNum w:abstractNumId="8" w15:restartNumberingAfterBreak="0">
     <w:nsid w:val="48C0307B"/>
     <w:multiLevelType w:val="multilevel"/>
     <w:tmpl w:val="0410001F"/>
@@ -4849,7 +7055,7 @@
       </w:rPr>
     </w:lvl>
   </w:abstractNum>
-  <w:abstractNum w:abstractNumId="8" w15:restartNumberingAfterBreak="0">
+  <w:abstractNum w:abstractNumId="9" w15:restartNumberingAfterBreak="0">
     <w:nsid w:val="584774CD"/>
     <w:multiLevelType w:val="hybridMultilevel"/>
     <w:tmpl w:val="565A52C6"/>
@@ -4962,7 +7168,7 @@
       </w:rPr>
     </w:lvl>
   </w:abstractNum>
-  <w:abstractNum w:abstractNumId="9" w15:restartNumberingAfterBreak="0">
+  <w:abstractNum w:abstractNumId="10" w15:restartNumberingAfterBreak="0">
     <w:nsid w:val="6A4937C0"/>
     <w:multiLevelType w:val="hybridMultilevel"/>
     <w:tmpl w:val="0644C842"/>
@@ -5048,7 +7254,7 @@
       </w:pPr>
     </w:lvl>
   </w:abstractNum>
-  <w:abstractNum w:abstractNumId="10" w15:restartNumberingAfterBreak="0">
+  <w:abstractNum w:abstractNumId="11" w15:restartNumberingAfterBreak="0">
     <w:nsid w:val="6DB20639"/>
     <w:multiLevelType w:val="hybridMultilevel"/>
     <w:tmpl w:val="F0441AB8"/>
@@ -5161,7 +7367,7 @@
       </w:rPr>
     </w:lvl>
   </w:abstractNum>
-  <w:abstractNum w:abstractNumId="11" w15:restartNumberingAfterBreak="0">
+  <w:abstractNum w:abstractNumId="12" w15:restartNumberingAfterBreak="0">
     <w:nsid w:val="73735300"/>
     <w:multiLevelType w:val="hybridMultilevel"/>
     <w:tmpl w:val="C39838EA"/>
@@ -5248,13 +7454,13 @@
     </w:lvl>
   </w:abstractNum>
   <w:num w:numId="1" w16cid:durableId="1729955839">
-    <w:abstractNumId w:val="9"/>
+    <w:abstractNumId w:val="10"/>
   </w:num>
   <w:num w:numId="2" w16cid:durableId="882208912">
-    <w:abstractNumId w:val="4"/>
+    <w:abstractNumId w:val="5"/>
   </w:num>
   <w:num w:numId="3" w16cid:durableId="2118325385">
-    <w:abstractNumId w:val="11"/>
+    <w:abstractNumId w:val="12"/>
   </w:num>
   <w:num w:numId="4" w16cid:durableId="1805810936">
     <w:abstractNumId w:val="0"/>
@@ -5263,25 +7469,28 @@
     <w:abstractNumId w:val="2"/>
   </w:num>
   <w:num w:numId="6" w16cid:durableId="72164194">
-    <w:abstractNumId w:val="6"/>
+    <w:abstractNumId w:val="7"/>
   </w:num>
   <w:num w:numId="7" w16cid:durableId="696850630">
-    <w:abstractNumId w:val="3"/>
+    <w:abstractNumId w:val="4"/>
   </w:num>
   <w:num w:numId="8" w16cid:durableId="633408106">
-    <w:abstractNumId w:val="7"/>
+    <w:abstractNumId w:val="8"/>
   </w:num>
   <w:num w:numId="9" w16cid:durableId="907686083">
-    <w:abstractNumId w:val="10"/>
+    <w:abstractNumId w:val="11"/>
   </w:num>
   <w:num w:numId="10" w16cid:durableId="1810248850">
     <w:abstractNumId w:val="1"/>
   </w:num>
   <w:num w:numId="11" w16cid:durableId="1048803791">
-    <w:abstractNumId w:val="8"/>
+    <w:abstractNumId w:val="9"/>
   </w:num>
   <w:num w:numId="12" w16cid:durableId="636256198">
-    <w:abstractNumId w:val="5"/>
+    <w:abstractNumId w:val="6"/>
+  </w:num>
+  <w:num w:numId="13" w16cid:durableId="1321613549">
+    <w:abstractNumId w:val="3"/>
   </w:num>
 </w:numbering>
 </file>
@@ -5740,6 +7949,27 @@
       <w:szCs w:val="26"/>
     </w:rPr>
   </w:style>
+  <w:style w:type="paragraph" w:styleId="Titolo3">
+    <w:name w:val="heading 3"/>
+    <w:basedOn w:val="Normale"/>
+    <w:next w:val="Normale"/>
+    <w:link w:val="Titolo3Carattere"/>
+    <w:uiPriority w:val="9"/>
+    <w:unhideWhenUsed/>
+    <w:qFormat/>
+    <w:rsid w:val="0076072E"/>
+    <w:pPr>
+      <w:keepNext/>
+      <w:keepLines/>
+      <w:spacing w:before="40" w:after="0"/>
+      <w:outlineLvl w:val="2"/>
+    </w:pPr>
+    <w:rPr>
+      <w:rFonts w:asciiTheme="majorHAnsi" w:eastAsiaTheme="majorEastAsia" w:hAnsiTheme="majorHAnsi" w:cstheme="majorBidi"/>
+      <w:color w:val="0A2F40" w:themeColor="accent1" w:themeShade="7F"/>
+      <w:sz w:val="24"/>
+    </w:rPr>
+  </w:style>
   <w:style w:type="character" w:default="1" w:styleId="Carpredefinitoparagrafo">
     <w:name w:val="Default Paragraph Font"/>
     <w:uiPriority w:val="1"/>
@@ -5941,6 +8171,17 @@
       <w:sz w:val="22"/>
     </w:rPr>
   </w:style>
+  <w:style w:type="character" w:customStyle="1" w:styleId="Titolo3Carattere">
+    <w:name w:val="Titolo 3 Carattere"/>
+    <w:basedOn w:val="Carpredefinitoparagrafo"/>
+    <w:link w:val="Titolo3"/>
+    <w:uiPriority w:val="9"/>
+    <w:rsid w:val="0076072E"/>
+    <w:rPr>
+      <w:rFonts w:asciiTheme="majorHAnsi" w:eastAsiaTheme="majorEastAsia" w:hAnsiTheme="majorHAnsi" w:cstheme="majorBidi"/>
+      <w:color w:val="0A2F40" w:themeColor="accent1" w:themeShade="7F"/>
+    </w:rPr>
+  </w:style>
 </w:styles>
 </file>
 
@@ -6073,7 +8314,11 @@
     <w:rsid w:val="005F05A4"/>
     <w:rsid w:val="006B62CD"/>
     <w:rsid w:val="006F5ECB"/>
+    <w:rsid w:val="00853B21"/>
+    <w:rsid w:val="008C7631"/>
     <w:rsid w:val="009D6C4A"/>
+    <w:rsid w:val="00AA1219"/>
+    <w:rsid w:val="00EE35BE"/>
     <w:rsid w:val="00F96DDE"/>
   </w:rsids>
   <m:mathPr>

</xml_diff>